<commit_message>
doc: document for working of Balboa
</commit_message>
<xml_diff>
--- a/doc/BALBOA WORKING.docx
+++ b/doc/BALBOA WORKING.docx
@@ -229,190 +229,334 @@
     </w:p>
     <w:p>
       <w:pPr>
-        <w:spacing w:line="240" w:lineRule="auto"/>
-        <w:jc w:val="both"/>
-        <w:rPr>
-          <w:rFonts w:cstheme="minorHAnsi"/>
-          <w:sz w:val="28"/>
-          <w:szCs w:val="28"/>
-        </w:rPr>
-      </w:pPr>
-      <w:r>
-        <w:rPr>
-          <w:rFonts w:cstheme="minorHAnsi"/>
-          <w:sz w:val="28"/>
-          <w:szCs w:val="28"/>
-        </w:rPr>
-        <w:t xml:space="preserve">Display will show </w:t>
-      </w:r>
-      <w:r>
-        <w:rPr>
-          <w:rFonts w:cstheme="minorHAnsi"/>
-          <w:sz w:val="28"/>
-          <w:szCs w:val="28"/>
-        </w:rPr>
-        <w:t>“</w:t>
-      </w:r>
-      <w:r>
-        <w:rPr>
-          <w:rFonts w:cstheme="minorHAnsi"/>
-          <w:sz w:val="28"/>
-          <w:szCs w:val="28"/>
-        </w:rPr>
-        <w:t>TEMPERATURE</w:t>
-      </w:r>
-      <w:r>
-        <w:rPr>
-          <w:rFonts w:cstheme="minorHAnsi"/>
-          <w:sz w:val="28"/>
-          <w:szCs w:val="28"/>
-        </w:rPr>
-        <w:t>”</w:t>
-      </w:r>
-      <w:r>
-        <w:rPr>
-          <w:rFonts w:cstheme="minorHAnsi"/>
-          <w:sz w:val="28"/>
-          <w:szCs w:val="28"/>
-        </w:rPr>
-        <w:t xml:space="preserve"> at the centre; </w:t>
-      </w:r>
-      <w:r>
-        <w:rPr>
-          <w:rFonts w:cstheme="minorHAnsi"/>
-          <w:sz w:val="28"/>
-          <w:szCs w:val="28"/>
-        </w:rPr>
-        <w:t>“</w:t>
-      </w:r>
-      <w:r>
-        <w:rPr>
-          <w:rFonts w:cstheme="minorHAnsi"/>
-          <w:sz w:val="28"/>
-          <w:szCs w:val="28"/>
-        </w:rPr>
-        <w:t>SLEEP BUTTON</w:t>
-      </w:r>
-      <w:r>
-        <w:rPr>
-          <w:rFonts w:cstheme="minorHAnsi"/>
-          <w:sz w:val="28"/>
-          <w:szCs w:val="28"/>
-        </w:rPr>
-        <w:t>” icon</w:t>
-      </w:r>
-      <w:r>
-        <w:rPr>
-          <w:rFonts w:cstheme="minorHAnsi"/>
-          <w:sz w:val="28"/>
-          <w:szCs w:val="28"/>
-        </w:rPr>
-        <w:t xml:space="preserve">, </w:t>
-      </w:r>
-      <w:r>
-        <w:rPr>
-          <w:rFonts w:cstheme="minorHAnsi"/>
-          <w:sz w:val="28"/>
-          <w:szCs w:val="28"/>
-        </w:rPr>
-        <w:t>“</w:t>
-      </w:r>
-      <w:r>
-        <w:rPr>
-          <w:rFonts w:cstheme="minorHAnsi"/>
-          <w:sz w:val="28"/>
-          <w:szCs w:val="28"/>
-        </w:rPr>
-        <w:t>TEMPERATURE RANGE</w:t>
-      </w:r>
-      <w:r>
-        <w:rPr>
-          <w:rFonts w:cstheme="minorHAnsi"/>
-          <w:sz w:val="28"/>
-          <w:szCs w:val="28"/>
-        </w:rPr>
-        <w:t>”</w:t>
-      </w:r>
-      <w:r>
-        <w:rPr>
-          <w:rFonts w:cstheme="minorHAnsi"/>
-          <w:sz w:val="28"/>
-          <w:szCs w:val="28"/>
-        </w:rPr>
-        <w:t xml:space="preserve"> </w:t>
-      </w:r>
-      <w:r>
-        <w:rPr>
-          <w:rFonts w:cstheme="minorHAnsi"/>
-          <w:sz w:val="28"/>
-          <w:szCs w:val="28"/>
-        </w:rPr>
-        <w:t>i</w:t>
-      </w:r>
-      <w:r>
-        <w:rPr>
-          <w:rFonts w:cstheme="minorHAnsi"/>
-          <w:sz w:val="28"/>
-          <w:szCs w:val="28"/>
-        </w:rPr>
-        <w:t xml:space="preserve">con and </w:t>
-      </w:r>
-      <w:r>
-        <w:rPr>
-          <w:rFonts w:cstheme="minorHAnsi"/>
-          <w:sz w:val="28"/>
-          <w:szCs w:val="28"/>
-        </w:rPr>
-        <w:t>“</w:t>
-      </w:r>
-      <w:r>
-        <w:rPr>
-          <w:rFonts w:cstheme="minorHAnsi"/>
-          <w:sz w:val="28"/>
-          <w:szCs w:val="28"/>
-        </w:rPr>
-        <w:t>HEAT MODE</w:t>
-      </w:r>
-      <w:r>
-        <w:rPr>
-          <w:rFonts w:cstheme="minorHAnsi"/>
-          <w:sz w:val="28"/>
-          <w:szCs w:val="28"/>
-        </w:rPr>
-        <w:t>”</w:t>
-      </w:r>
-      <w:r>
-        <w:rPr>
-          <w:rFonts w:cstheme="minorHAnsi"/>
-          <w:sz w:val="28"/>
-          <w:szCs w:val="28"/>
-        </w:rPr>
-        <w:t xml:space="preserve"> </w:t>
-      </w:r>
-      <w:r>
-        <w:rPr>
-          <w:rFonts w:cstheme="minorHAnsi"/>
-          <w:sz w:val="28"/>
-          <w:szCs w:val="28"/>
-        </w:rPr>
-        <w:t>i</w:t>
-      </w:r>
-      <w:r>
-        <w:rPr>
-          <w:rFonts w:cstheme="minorHAnsi"/>
-          <w:sz w:val="28"/>
-          <w:szCs w:val="28"/>
-        </w:rPr>
-        <w:t>con at the Upper Left Corner</w:t>
-      </w:r>
-      <w:r>
-        <w:rPr>
-          <w:rFonts w:cstheme="minorHAnsi"/>
-          <w:sz w:val="28"/>
-          <w:szCs w:val="28"/>
-        </w:rPr>
-        <w:t>.</w:t>
-      </w:r>
+        <w:pStyle w:val="ListParagraph"/>
+        <w:numPr>
+          <w:ilvl w:val="0"/>
+          <w:numId w:val="7"/>
+        </w:numPr>
+        <w:spacing w:line="240" w:lineRule="auto"/>
+        <w:jc w:val="both"/>
+        <w:rPr>
+          <w:rFonts w:cstheme="minorHAnsi"/>
+          <w:sz w:val="28"/>
+          <w:szCs w:val="28"/>
+        </w:rPr>
+      </w:pPr>
+      <w:r>
+        <w:rPr>
+          <w:rFonts w:cstheme="minorHAnsi"/>
+          <w:sz w:val="28"/>
+          <w:szCs w:val="28"/>
+        </w:rPr>
+        <w:t>Top Left Corer</w:t>
+      </w:r>
+    </w:p>
+    <w:p>
+      <w:pPr>
+        <w:pStyle w:val="ListParagraph"/>
+        <w:numPr>
+          <w:ilvl w:val="1"/>
+          <w:numId w:val="7"/>
+        </w:numPr>
+        <w:spacing w:line="240" w:lineRule="auto"/>
+        <w:jc w:val="both"/>
+        <w:rPr>
+          <w:rFonts w:cstheme="minorHAnsi"/>
+          <w:sz w:val="28"/>
+          <w:szCs w:val="28"/>
+        </w:rPr>
+      </w:pPr>
+      <w:r>
+        <w:rPr>
+          <w:rFonts w:cstheme="minorHAnsi"/>
+          <w:sz w:val="28"/>
+          <w:szCs w:val="28"/>
+        </w:rPr>
+        <w:t>“SLEEP BUTTON” icon</w:t>
+      </w:r>
+    </w:p>
+    <w:p>
+      <w:pPr>
+        <w:pStyle w:val="ListParagraph"/>
+        <w:numPr>
+          <w:ilvl w:val="1"/>
+          <w:numId w:val="7"/>
+        </w:numPr>
+        <w:spacing w:line="240" w:lineRule="auto"/>
+        <w:jc w:val="both"/>
+        <w:rPr>
+          <w:rFonts w:cstheme="minorHAnsi"/>
+          <w:sz w:val="28"/>
+          <w:szCs w:val="28"/>
+        </w:rPr>
+      </w:pPr>
+      <w:r>
+        <w:rPr>
+          <w:rFonts w:cstheme="minorHAnsi"/>
+          <w:sz w:val="28"/>
+          <w:szCs w:val="28"/>
+        </w:rPr>
+        <w:t>“TEMPERATURE RANGE” icon</w:t>
+      </w:r>
+    </w:p>
+    <w:p>
+      <w:pPr>
+        <w:pStyle w:val="ListParagraph"/>
+        <w:numPr>
+          <w:ilvl w:val="1"/>
+          <w:numId w:val="7"/>
+        </w:numPr>
+        <w:spacing w:line="240" w:lineRule="auto"/>
+        <w:jc w:val="both"/>
+        <w:rPr>
+          <w:rFonts w:cstheme="minorHAnsi"/>
+          <w:sz w:val="28"/>
+          <w:szCs w:val="28"/>
+        </w:rPr>
+      </w:pPr>
+      <w:r>
+        <w:rPr>
+          <w:rFonts w:cstheme="minorHAnsi"/>
+          <w:sz w:val="28"/>
+          <w:szCs w:val="28"/>
+        </w:rPr>
+        <w:t>“HEAT MODE” icon</w:t>
+      </w:r>
+    </w:p>
+    <w:p>
+      <w:pPr>
+        <w:pStyle w:val="ListParagraph"/>
+        <w:numPr>
+          <w:ilvl w:val="0"/>
+          <w:numId w:val="7"/>
+        </w:numPr>
+        <w:spacing w:line="240" w:lineRule="auto"/>
+        <w:jc w:val="both"/>
+        <w:rPr>
+          <w:rFonts w:cstheme="minorHAnsi"/>
+          <w:sz w:val="28"/>
+          <w:szCs w:val="28"/>
+        </w:rPr>
+      </w:pPr>
+      <w:r>
+        <w:rPr>
+          <w:rFonts w:cstheme="minorHAnsi"/>
+          <w:sz w:val="28"/>
+          <w:szCs w:val="28"/>
+        </w:rPr>
+        <w:t>C</w:t>
+      </w:r>
+      <w:r>
+        <w:rPr>
+          <w:rFonts w:cstheme="minorHAnsi"/>
+          <w:sz w:val="28"/>
+          <w:szCs w:val="28"/>
+        </w:rPr>
+        <w:t>entre</w:t>
+      </w:r>
+      <w:r>
+        <w:rPr>
+          <w:rFonts w:cstheme="minorHAnsi"/>
+          <w:sz w:val="28"/>
+          <w:szCs w:val="28"/>
+        </w:rPr>
+        <w:t xml:space="preserve"> of the screen</w:t>
+      </w:r>
+    </w:p>
+    <w:p>
+      <w:pPr>
+        <w:pStyle w:val="ListParagraph"/>
+        <w:numPr>
+          <w:ilvl w:val="1"/>
+          <w:numId w:val="7"/>
+        </w:numPr>
+        <w:spacing w:line="240" w:lineRule="auto"/>
+        <w:jc w:val="both"/>
+        <w:rPr>
+          <w:rFonts w:cstheme="minorHAnsi"/>
+          <w:sz w:val="28"/>
+          <w:szCs w:val="28"/>
+        </w:rPr>
+      </w:pPr>
+      <w:r>
+        <w:rPr>
+          <w:rFonts w:cstheme="minorHAnsi"/>
+          <w:sz w:val="28"/>
+          <w:szCs w:val="28"/>
+        </w:rPr>
+        <w:t>“TEMPERATURE”</w:t>
+      </w:r>
+      <w:r>
+        <w:rPr>
+          <w:rFonts w:cstheme="minorHAnsi"/>
+          <w:sz w:val="28"/>
+          <w:szCs w:val="28"/>
+        </w:rPr>
+        <w:t xml:space="preserve"> – Current and Set temp.</w:t>
+      </w:r>
+    </w:p>
+    <w:p>
+      <w:pPr>
+        <w:spacing w:line="240" w:lineRule="auto"/>
+        <w:jc w:val="both"/>
+        <w:rPr>
+          <w:rFonts w:cstheme="minorHAnsi"/>
+          <w:b/>
+          <w:sz w:val="28"/>
+          <w:szCs w:val="28"/>
+        </w:rPr>
+      </w:pPr>
+      <w:r>
+        <w:rPr>
+          <w:rFonts w:cstheme="minorHAnsi"/>
+          <w:b/>
+          <w:sz w:val="28"/>
+          <w:szCs w:val="28"/>
+        </w:rPr>
+        <w:t>Sleep Icon:</w:t>
+      </w:r>
+    </w:p>
+    <w:p>
+      <w:pPr>
+        <w:spacing w:line="240" w:lineRule="auto"/>
+        <w:jc w:val="center"/>
+        <w:rPr>
+          <w:rFonts w:cstheme="minorHAnsi"/>
+          <w:b/>
+          <w:sz w:val="28"/>
+          <w:szCs w:val="28"/>
+        </w:rPr>
+      </w:pPr>
+      <w:r>
+        <w:rPr>
+          <w:rFonts w:cstheme="minorHAnsi"/>
+          <w:noProof/>
+          <w:sz w:val="28"/>
+          <w:szCs w:val="28"/>
+        </w:rPr>
+        <w:drawing>
+          <wp:inline distT="0" distB="0" distL="0" distR="0" wp14:anchorId="0E7A74C6" wp14:editId="7A8DDA8E">
+            <wp:extent cx="4445876" cy="2758440"/>
+            <wp:effectExtent l="0" t="0" r="0" b="3810"/>
+            <wp:docPr id="1" name="Picture 1"/>
+            <wp:cNvGraphicFramePr>
+              <a:graphicFrameLocks xmlns:a="http://schemas.openxmlformats.org/drawingml/2006/main" noChangeAspect="1"/>
+            </wp:cNvGraphicFramePr>
+            <a:graphic xmlns:a="http://schemas.openxmlformats.org/drawingml/2006/main">
+              <a:graphicData uri="http://schemas.openxmlformats.org/drawingml/2006/picture">
+                <pic:pic xmlns:pic="http://schemas.openxmlformats.org/drawingml/2006/picture">
+                  <pic:nvPicPr>
+                    <pic:cNvPr id="1" name="Display_sleep_icon.jpg"/>
+                    <pic:cNvPicPr/>
+                  </pic:nvPicPr>
+                  <pic:blipFill>
+                    <a:blip r:embed="rId8" cstate="print">
+                      <a:extLst>
+                        <a:ext uri="{28A0092B-C50C-407E-A947-70E740481C1C}">
+                          <a14:useLocalDpi xmlns:a14="http://schemas.microsoft.com/office/drawing/2010/main" val="0"/>
+                        </a:ext>
+                      </a:extLst>
+                    </a:blip>
+                    <a:stretch>
+                      <a:fillRect/>
+                    </a:stretch>
+                  </pic:blipFill>
+                  <pic:spPr>
+                    <a:xfrm>
+                      <a:off x="0" y="0"/>
+                      <a:ext cx="4594308" cy="2850535"/>
+                    </a:xfrm>
+                    <a:prstGeom prst="rect">
+                      <a:avLst/>
+                    </a:prstGeom>
+                  </pic:spPr>
+                </pic:pic>
+              </a:graphicData>
+            </a:graphic>
+          </wp:inline>
+        </w:drawing>
+      </w:r>
+    </w:p>
+    <w:p>
+      <w:pPr>
+        <w:pStyle w:val="ListParagraph"/>
+        <w:numPr>
+          <w:ilvl w:val="0"/>
+          <w:numId w:val="6"/>
+        </w:numPr>
+        <w:spacing w:line="240" w:lineRule="auto"/>
+        <w:jc w:val="both"/>
+        <w:rPr>
+          <w:rFonts w:cstheme="minorHAnsi"/>
+          <w:sz w:val="28"/>
+          <w:szCs w:val="28"/>
+        </w:rPr>
+      </w:pPr>
+      <w:r>
+        <w:rPr>
+          <w:rFonts w:cstheme="minorHAnsi"/>
+          <w:sz w:val="28"/>
+          <w:szCs w:val="28"/>
+        </w:rPr>
+        <w:t>Single touch - Turn off display</w:t>
+      </w:r>
+    </w:p>
+    <w:p>
+      <w:pPr>
+        <w:pStyle w:val="ListParagraph"/>
+        <w:numPr>
+          <w:ilvl w:val="0"/>
+          <w:numId w:val="6"/>
+        </w:numPr>
+        <w:spacing w:line="240" w:lineRule="auto"/>
+        <w:jc w:val="both"/>
+        <w:rPr>
+          <w:rFonts w:cstheme="minorHAnsi"/>
+          <w:sz w:val="28"/>
+          <w:szCs w:val="28"/>
+        </w:rPr>
+      </w:pPr>
+      <w:r>
+        <w:rPr>
+          <w:rFonts w:cstheme="minorHAnsi"/>
+          <w:sz w:val="28"/>
+          <w:szCs w:val="28"/>
+        </w:rPr>
+        <w:t>Touch display again - Turn on display</w:t>
+      </w:r>
+    </w:p>
+    <w:p>
+      <w:pPr>
+        <w:spacing w:line="240" w:lineRule="auto"/>
+        <w:jc w:val="both"/>
+        <w:rPr>
+          <w:rFonts w:cstheme="minorHAnsi"/>
+          <w:sz w:val="28"/>
+          <w:szCs w:val="28"/>
+        </w:rPr>
+      </w:pPr>
+    </w:p>
+    <w:p>
+      <w:pPr>
+        <w:spacing w:line="240" w:lineRule="auto"/>
+        <w:jc w:val="both"/>
+        <w:rPr>
+          <w:rFonts w:cstheme="minorHAnsi"/>
+          <w:sz w:val="28"/>
+          <w:szCs w:val="28"/>
+        </w:rPr>
+      </w:pPr>
+    </w:p>
+    <w:p>
+      <w:pPr>
+        <w:spacing w:line="240" w:lineRule="auto"/>
+        <w:jc w:val="both"/>
+        <w:rPr>
+          <w:rFonts w:cstheme="minorHAnsi"/>
+          <w:sz w:val="28"/>
+          <w:szCs w:val="28"/>
+        </w:rPr>
+      </w:pPr>
     </w:p>
     <w:p>
       <w:pPr>
@@ -458,6 +602,91 @@
         </w:rPr>
         <w:t>L</w:t>
       </w:r>
+      <w:r>
+        <w:rPr>
+          <w:rFonts w:cstheme="minorHAnsi"/>
+          <w:sz w:val="28"/>
+          <w:szCs w:val="28"/>
+        </w:rPr>
+        <w:t xml:space="preserve"> </w:t>
+      </w:r>
+      <w:r>
+        <w:rPr>
+          <w:rFonts w:cstheme="minorHAnsi"/>
+          <w:sz w:val="28"/>
+          <w:szCs w:val="28"/>
+        </w:rPr>
+        <w:t>–</w:t>
+      </w:r>
+      <w:r>
+        <w:rPr>
+          <w:rFonts w:cstheme="minorHAnsi"/>
+          <w:sz w:val="28"/>
+          <w:szCs w:val="28"/>
+        </w:rPr>
+        <w:t xml:space="preserve"> Low</w:t>
+      </w:r>
+    </w:p>
+    <w:p>
+      <w:pPr>
+        <w:pStyle w:val="ListParagraph"/>
+        <w:spacing w:line="240" w:lineRule="auto"/>
+        <w:jc w:val="center"/>
+        <w:rPr>
+          <w:rFonts w:cstheme="minorHAnsi"/>
+          <w:sz w:val="28"/>
+          <w:szCs w:val="28"/>
+        </w:rPr>
+      </w:pPr>
+      <w:r>
+        <w:rPr>
+          <w:rFonts w:cstheme="minorHAnsi"/>
+          <w:noProof/>
+          <w:sz w:val="28"/>
+          <w:szCs w:val="28"/>
+        </w:rPr>
+        <w:drawing>
+          <wp:inline distT="0" distB="0" distL="0" distR="0" wp14:anchorId="08D325B4" wp14:editId="7CD642EE">
+            <wp:extent cx="4689475" cy="2885090"/>
+            <wp:effectExtent l="0" t="0" r="0" b="0"/>
+            <wp:docPr id="2" name="Picture 2"/>
+            <wp:cNvGraphicFramePr>
+              <a:graphicFrameLocks xmlns:a="http://schemas.openxmlformats.org/drawingml/2006/main" noChangeAspect="1"/>
+            </wp:cNvGraphicFramePr>
+            <a:graphic xmlns:a="http://schemas.openxmlformats.org/drawingml/2006/main">
+              <a:graphicData uri="http://schemas.openxmlformats.org/drawingml/2006/picture">
+                <pic:pic xmlns:pic="http://schemas.openxmlformats.org/drawingml/2006/picture">
+                  <pic:nvPicPr>
+                    <pic:cNvPr id="2" name="Temp_range_low_icon.jpg"/>
+                    <pic:cNvPicPr/>
+                  </pic:nvPicPr>
+                  <pic:blipFill>
+                    <a:blip r:embed="rId9" cstate="print">
+                      <a:extLst>
+                        <a:ext uri="{28A0092B-C50C-407E-A947-70E740481C1C}">
+                          <a14:useLocalDpi xmlns:a14="http://schemas.microsoft.com/office/drawing/2010/main" val="0"/>
+                        </a:ext>
+                      </a:extLst>
+                    </a:blip>
+                    <a:stretch>
+                      <a:fillRect/>
+                    </a:stretch>
+                  </pic:blipFill>
+                  <pic:spPr>
+                    <a:xfrm>
+                      <a:off x="0" y="0"/>
+                      <a:ext cx="4855752" cy="2987388"/>
+                    </a:xfrm>
+                    <a:prstGeom prst="rect">
+                      <a:avLst/>
+                    </a:prstGeom>
+                  </pic:spPr>
+                </pic:pic>
+              </a:graphicData>
+            </a:graphic>
+          </wp:inline>
+        </w:drawing>
+      </w:r>
     </w:p>
     <w:p>
       <w:pPr>
@@ -482,25 +711,183 @@
         </w:rPr>
         <w:t>H</w:t>
       </w:r>
-    </w:p>
-    <w:p>
-      <w:pPr>
-        <w:spacing w:line="240" w:lineRule="auto"/>
-        <w:jc w:val="both"/>
-        <w:rPr>
-          <w:rFonts w:cstheme="minorHAnsi"/>
-          <w:b/>
-          <w:sz w:val="28"/>
-          <w:szCs w:val="28"/>
-        </w:rPr>
-      </w:pPr>
-      <w:r>
-        <w:rPr>
-          <w:rFonts w:cstheme="minorHAnsi"/>
-          <w:b/>
-          <w:sz w:val="28"/>
-          <w:szCs w:val="28"/>
-        </w:rPr>
+      <w:r>
+        <w:rPr>
+          <w:rFonts w:cstheme="minorHAnsi"/>
+          <w:sz w:val="28"/>
+          <w:szCs w:val="28"/>
+        </w:rPr>
+        <w:t xml:space="preserve"> </w:t>
+      </w:r>
+      <w:r>
+        <w:rPr>
+          <w:rFonts w:cstheme="minorHAnsi"/>
+          <w:sz w:val="28"/>
+          <w:szCs w:val="28"/>
+        </w:rPr>
+        <w:t>–</w:t>
+      </w:r>
+      <w:r>
+        <w:rPr>
+          <w:rFonts w:cstheme="minorHAnsi"/>
+          <w:sz w:val="28"/>
+          <w:szCs w:val="28"/>
+        </w:rPr>
+        <w:t xml:space="preserve"> High</w:t>
+      </w:r>
+    </w:p>
+    <w:p>
+      <w:pPr>
+        <w:pStyle w:val="ListParagraph"/>
+        <w:spacing w:line="240" w:lineRule="auto"/>
+        <w:jc w:val="center"/>
+        <w:rPr>
+          <w:rFonts w:cstheme="minorHAnsi"/>
+          <w:sz w:val="28"/>
+          <w:szCs w:val="28"/>
+        </w:rPr>
+      </w:pPr>
+      <w:r>
+        <w:rPr>
+          <w:rFonts w:cstheme="minorHAnsi"/>
+          <w:noProof/>
+          <w:sz w:val="28"/>
+          <w:szCs w:val="28"/>
+        </w:rPr>
+        <w:drawing>
+          <wp:inline distT="0" distB="0" distL="0" distR="0" wp14:anchorId="2C33D2FF" wp14:editId="0912983E">
+            <wp:extent cx="4748044" cy="2963918"/>
+            <wp:effectExtent l="0" t="0" r="0" b="8255"/>
+            <wp:docPr id="3" name="Picture 3"/>
+            <wp:cNvGraphicFramePr>
+              <a:graphicFrameLocks xmlns:a="http://schemas.openxmlformats.org/drawingml/2006/main" noChangeAspect="1"/>
+            </wp:cNvGraphicFramePr>
+            <a:graphic xmlns:a="http://schemas.openxmlformats.org/drawingml/2006/main">
+              <a:graphicData uri="http://schemas.openxmlformats.org/drawingml/2006/picture">
+                <pic:pic xmlns:pic="http://schemas.openxmlformats.org/drawingml/2006/picture">
+                  <pic:nvPicPr>
+                    <pic:cNvPr id="3" name="Temp_range_high_icon.jpg"/>
+                    <pic:cNvPicPr/>
+                  </pic:nvPicPr>
+                  <pic:blipFill>
+                    <a:blip r:embed="rId10">
+                      <a:extLst>
+                        <a:ext uri="{28A0092B-C50C-407E-A947-70E740481C1C}">
+                          <a14:useLocalDpi xmlns:a14="http://schemas.microsoft.com/office/drawing/2010/main" val="0"/>
+                        </a:ext>
+                      </a:extLst>
+                    </a:blip>
+                    <a:stretch>
+                      <a:fillRect/>
+                    </a:stretch>
+                  </pic:blipFill>
+                  <pic:spPr>
+                    <a:xfrm>
+                      <a:off x="0" y="0"/>
+                      <a:ext cx="4898890" cy="3058082"/>
+                    </a:xfrm>
+                    <a:prstGeom prst="rect">
+                      <a:avLst/>
+                    </a:prstGeom>
+                  </pic:spPr>
+                </pic:pic>
+              </a:graphicData>
+            </a:graphic>
+          </wp:inline>
+        </w:drawing>
+      </w:r>
+    </w:p>
+    <w:p>
+      <w:pPr>
+        <w:spacing w:line="240" w:lineRule="auto"/>
+        <w:jc w:val="both"/>
+        <w:rPr>
+          <w:rFonts w:cstheme="minorHAnsi"/>
+          <w:b/>
+          <w:sz w:val="28"/>
+          <w:szCs w:val="28"/>
+        </w:rPr>
+      </w:pPr>
+    </w:p>
+    <w:p>
+      <w:pPr>
+        <w:spacing w:line="240" w:lineRule="auto"/>
+        <w:jc w:val="both"/>
+        <w:rPr>
+          <w:rFonts w:cstheme="minorHAnsi"/>
+          <w:b/>
+          <w:sz w:val="28"/>
+          <w:szCs w:val="28"/>
+        </w:rPr>
+      </w:pPr>
+    </w:p>
+    <w:p>
+      <w:pPr>
+        <w:spacing w:line="240" w:lineRule="auto"/>
+        <w:jc w:val="both"/>
+        <w:rPr>
+          <w:rFonts w:cstheme="minorHAnsi"/>
+          <w:b/>
+          <w:sz w:val="28"/>
+          <w:szCs w:val="28"/>
+        </w:rPr>
+      </w:pPr>
+    </w:p>
+    <w:p>
+      <w:pPr>
+        <w:spacing w:line="240" w:lineRule="auto"/>
+        <w:jc w:val="both"/>
+        <w:rPr>
+          <w:rFonts w:cstheme="minorHAnsi"/>
+          <w:b/>
+          <w:sz w:val="28"/>
+          <w:szCs w:val="28"/>
+        </w:rPr>
+      </w:pPr>
+    </w:p>
+    <w:p>
+      <w:pPr>
+        <w:spacing w:line="240" w:lineRule="auto"/>
+        <w:jc w:val="both"/>
+        <w:rPr>
+          <w:rFonts w:cstheme="minorHAnsi"/>
+          <w:b/>
+          <w:sz w:val="28"/>
+          <w:szCs w:val="28"/>
+        </w:rPr>
+      </w:pPr>
+    </w:p>
+    <w:p>
+      <w:pPr>
+        <w:spacing w:line="240" w:lineRule="auto"/>
+        <w:jc w:val="both"/>
+        <w:rPr>
+          <w:rFonts w:cstheme="minorHAnsi"/>
+          <w:b/>
+          <w:sz w:val="28"/>
+          <w:szCs w:val="28"/>
+        </w:rPr>
+      </w:pPr>
+    </w:p>
+    <w:p>
+      <w:pPr>
+        <w:spacing w:line="240" w:lineRule="auto"/>
+        <w:jc w:val="both"/>
+        <w:rPr>
+          <w:rFonts w:cstheme="minorHAnsi"/>
+          <w:b/>
+          <w:sz w:val="28"/>
+          <w:szCs w:val="28"/>
+        </w:rPr>
+      </w:pPr>
+      <w:r>
+        <w:rPr>
+          <w:rFonts w:cstheme="minorHAnsi"/>
+          <w:b/>
+          <w:sz w:val="28"/>
+          <w:szCs w:val="28"/>
+        </w:rPr>
+        <w:lastRenderedPageBreak/>
         <w:t>Heating Mode Icon:</w:t>
       </w:r>
     </w:p>
@@ -527,6 +914,91 @@
         </w:rPr>
         <w:t>R</w:t>
       </w:r>
+      <w:r>
+        <w:rPr>
+          <w:rFonts w:cstheme="minorHAnsi"/>
+          <w:sz w:val="28"/>
+          <w:szCs w:val="28"/>
+        </w:rPr>
+        <w:t xml:space="preserve"> </w:t>
+      </w:r>
+      <w:r>
+        <w:rPr>
+          <w:rFonts w:cstheme="minorHAnsi"/>
+          <w:sz w:val="28"/>
+          <w:szCs w:val="28"/>
+        </w:rPr>
+        <w:t>–</w:t>
+      </w:r>
+      <w:r>
+        <w:rPr>
+          <w:rFonts w:cstheme="minorHAnsi"/>
+          <w:sz w:val="28"/>
+          <w:szCs w:val="28"/>
+        </w:rPr>
+        <w:t xml:space="preserve"> Ready</w:t>
+      </w:r>
+    </w:p>
+    <w:p>
+      <w:pPr>
+        <w:pStyle w:val="ListParagraph"/>
+        <w:spacing w:line="240" w:lineRule="auto"/>
+        <w:jc w:val="center"/>
+        <w:rPr>
+          <w:rFonts w:cstheme="minorHAnsi"/>
+          <w:sz w:val="28"/>
+          <w:szCs w:val="28"/>
+        </w:rPr>
+      </w:pPr>
+      <w:r>
+        <w:rPr>
+          <w:rFonts w:cstheme="minorHAnsi"/>
+          <w:noProof/>
+          <w:sz w:val="28"/>
+          <w:szCs w:val="28"/>
+        </w:rPr>
+        <w:drawing>
+          <wp:inline distT="0" distB="0" distL="0" distR="0" wp14:anchorId="0C94D3C6" wp14:editId="7D422C3F">
+            <wp:extent cx="4621952" cy="2727435"/>
+            <wp:effectExtent l="0" t="0" r="7620" b="0"/>
+            <wp:docPr id="4" name="Picture 4"/>
+            <wp:cNvGraphicFramePr>
+              <a:graphicFrameLocks xmlns:a="http://schemas.openxmlformats.org/drawingml/2006/main" noChangeAspect="1"/>
+            </wp:cNvGraphicFramePr>
+            <a:graphic xmlns:a="http://schemas.openxmlformats.org/drawingml/2006/main">
+              <a:graphicData uri="http://schemas.openxmlformats.org/drawingml/2006/picture">
+                <pic:pic xmlns:pic="http://schemas.openxmlformats.org/drawingml/2006/picture">
+                  <pic:nvPicPr>
+                    <pic:cNvPr id="4" name="Heat_mode_Ready_icon.jpg"/>
+                    <pic:cNvPicPr/>
+                  </pic:nvPicPr>
+                  <pic:blipFill>
+                    <a:blip r:embed="rId11" cstate="print">
+                      <a:extLst>
+                        <a:ext uri="{28A0092B-C50C-407E-A947-70E740481C1C}">
+                          <a14:useLocalDpi xmlns:a14="http://schemas.microsoft.com/office/drawing/2010/main" val="0"/>
+                        </a:ext>
+                      </a:extLst>
+                    </a:blip>
+                    <a:stretch>
+                      <a:fillRect/>
+                    </a:stretch>
+                  </pic:blipFill>
+                  <pic:spPr>
+                    <a:xfrm>
+                      <a:off x="0" y="0"/>
+                      <a:ext cx="4709993" cy="2779388"/>
+                    </a:xfrm>
+                    <a:prstGeom prst="rect">
+                      <a:avLst/>
+                    </a:prstGeom>
+                  </pic:spPr>
+                </pic:pic>
+              </a:graphicData>
+            </a:graphic>
+          </wp:inline>
+        </w:drawing>
+      </w:r>
     </w:p>
     <w:p>
       <w:pPr>
@@ -551,6 +1023,91 @@
         </w:rPr>
         <w:t>Resting R</w:t>
       </w:r>
+      <w:r>
+        <w:rPr>
+          <w:rFonts w:cstheme="minorHAnsi"/>
+          <w:sz w:val="28"/>
+          <w:szCs w:val="28"/>
+        </w:rPr>
+        <w:t xml:space="preserve"> </w:t>
+      </w:r>
+      <w:r>
+        <w:rPr>
+          <w:rFonts w:cstheme="minorHAnsi"/>
+          <w:sz w:val="28"/>
+          <w:szCs w:val="28"/>
+        </w:rPr>
+        <w:t>–</w:t>
+      </w:r>
+      <w:r>
+        <w:rPr>
+          <w:rFonts w:cstheme="minorHAnsi"/>
+          <w:sz w:val="28"/>
+          <w:szCs w:val="28"/>
+        </w:rPr>
+        <w:t xml:space="preserve"> Rest</w:t>
+      </w:r>
+    </w:p>
+    <w:p>
+      <w:pPr>
+        <w:pStyle w:val="ListParagraph"/>
+        <w:spacing w:line="240" w:lineRule="auto"/>
+        <w:jc w:val="center"/>
+        <w:rPr>
+          <w:rFonts w:cstheme="minorHAnsi"/>
+          <w:sz w:val="28"/>
+          <w:szCs w:val="28"/>
+        </w:rPr>
+      </w:pPr>
+      <w:r>
+        <w:rPr>
+          <w:rFonts w:cstheme="minorHAnsi"/>
+          <w:noProof/>
+          <w:sz w:val="28"/>
+          <w:szCs w:val="28"/>
+        </w:rPr>
+        <w:drawing>
+          <wp:inline distT="0" distB="0" distL="0" distR="0" wp14:anchorId="1457CD59" wp14:editId="220799E6">
+            <wp:extent cx="4598670" cy="2601310"/>
+            <wp:effectExtent l="0" t="0" r="0" b="8890"/>
+            <wp:docPr id="5" name="Picture 5"/>
+            <wp:cNvGraphicFramePr>
+              <a:graphicFrameLocks xmlns:a="http://schemas.openxmlformats.org/drawingml/2006/main" noChangeAspect="1"/>
+            </wp:cNvGraphicFramePr>
+            <a:graphic xmlns:a="http://schemas.openxmlformats.org/drawingml/2006/main">
+              <a:graphicData uri="http://schemas.openxmlformats.org/drawingml/2006/picture">
+                <pic:pic xmlns:pic="http://schemas.openxmlformats.org/drawingml/2006/picture">
+                  <pic:nvPicPr>
+                    <pic:cNvPr id="5" name="Heat_mode_rest_icon.jpg"/>
+                    <pic:cNvPicPr/>
+                  </pic:nvPicPr>
+                  <pic:blipFill>
+                    <a:blip r:embed="rId12">
+                      <a:extLst>
+                        <a:ext uri="{28A0092B-C50C-407E-A947-70E740481C1C}">
+                          <a14:useLocalDpi xmlns:a14="http://schemas.microsoft.com/office/drawing/2010/main" val="0"/>
+                        </a:ext>
+                      </a:extLst>
+                    </a:blip>
+                    <a:stretch>
+                      <a:fillRect/>
+                    </a:stretch>
+                  </pic:blipFill>
+                  <pic:spPr>
+                    <a:xfrm>
+                      <a:off x="0" y="0"/>
+                      <a:ext cx="4776005" cy="2701622"/>
+                    </a:xfrm>
+                    <a:prstGeom prst="rect">
+                      <a:avLst/>
+                    </a:prstGeom>
+                  </pic:spPr>
+                </pic:pic>
+              </a:graphicData>
+            </a:graphic>
+          </wp:inline>
+        </w:drawing>
+      </w:r>
     </w:p>
     <w:p>
       <w:pPr>
@@ -575,94 +1132,95 @@
         </w:rPr>
         <w:t>RR</w:t>
       </w:r>
-    </w:p>
-    <w:p>
-      <w:pPr>
-        <w:spacing w:line="240" w:lineRule="auto"/>
-        <w:jc w:val="both"/>
-        <w:rPr>
-          <w:rFonts w:cstheme="minorHAnsi"/>
-          <w:b/>
-          <w:sz w:val="28"/>
-          <w:szCs w:val="28"/>
-        </w:rPr>
-      </w:pPr>
-      <w:r>
-        <w:rPr>
-          <w:rFonts w:cstheme="minorHAnsi"/>
-          <w:b/>
-          <w:sz w:val="28"/>
-          <w:szCs w:val="28"/>
-        </w:rPr>
-        <w:t>Sleep Icon:</w:t>
-      </w:r>
-    </w:p>
-    <w:p>
-      <w:pPr>
-        <w:pStyle w:val="ListParagraph"/>
-        <w:numPr>
-          <w:ilvl w:val="0"/>
-          <w:numId w:val="6"/>
-        </w:numPr>
-        <w:spacing w:line="240" w:lineRule="auto"/>
-        <w:jc w:val="both"/>
-        <w:rPr>
-          <w:rFonts w:cstheme="minorHAnsi"/>
-          <w:sz w:val="28"/>
-          <w:szCs w:val="28"/>
-        </w:rPr>
-      </w:pPr>
-      <w:r>
-        <w:rPr>
-          <w:rFonts w:cstheme="minorHAnsi"/>
-          <w:sz w:val="28"/>
-          <w:szCs w:val="28"/>
-        </w:rPr>
-        <w:t>Will turn off the display. Not the spa-controller.</w:t>
-      </w:r>
-    </w:p>
-    <w:p>
-      <w:pPr>
-        <w:pStyle w:val="ListParagraph"/>
-        <w:numPr>
-          <w:ilvl w:val="0"/>
-          <w:numId w:val="6"/>
-        </w:numPr>
-        <w:spacing w:line="240" w:lineRule="auto"/>
-        <w:jc w:val="both"/>
-        <w:rPr>
-          <w:rFonts w:cstheme="minorHAnsi"/>
-          <w:sz w:val="28"/>
-          <w:szCs w:val="28"/>
-        </w:rPr>
-      </w:pPr>
-      <w:r>
-        <w:rPr>
-          <w:rFonts w:cstheme="minorHAnsi"/>
-          <w:sz w:val="28"/>
-          <w:szCs w:val="28"/>
-        </w:rPr>
-        <w:t>Touch the display once again to start it again.</w:t>
-      </w:r>
-    </w:p>
-    <w:p>
-      <w:pPr>
-        <w:spacing w:line="240" w:lineRule="auto"/>
-        <w:jc w:val="both"/>
-        <w:rPr>
-          <w:rFonts w:cstheme="minorHAnsi"/>
-          <w:b/>
-          <w:sz w:val="28"/>
-          <w:szCs w:val="28"/>
-        </w:rPr>
-      </w:pPr>
-      <w:r>
-        <w:rPr>
-          <w:rFonts w:cstheme="minorHAnsi"/>
-          <w:b/>
-          <w:sz w:val="28"/>
-          <w:szCs w:val="28"/>
-        </w:rPr>
+      <w:r>
+        <w:rPr>
+          <w:rFonts w:cstheme="minorHAnsi"/>
+          <w:sz w:val="28"/>
+          <w:szCs w:val="28"/>
+        </w:rPr>
+        <w:t xml:space="preserve"> – Ready/Rest</w:t>
+      </w:r>
+    </w:p>
+    <w:p>
+      <w:pPr>
+        <w:pStyle w:val="ListParagraph"/>
+        <w:spacing w:line="240" w:lineRule="auto"/>
+        <w:jc w:val="center"/>
+        <w:rPr>
+          <w:rFonts w:cstheme="minorHAnsi"/>
+          <w:sz w:val="28"/>
+          <w:szCs w:val="28"/>
+        </w:rPr>
+      </w:pPr>
+      <w:r>
+        <w:rPr>
+          <w:rFonts w:cstheme="minorHAnsi"/>
+          <w:noProof/>
+          <w:sz w:val="28"/>
+          <w:szCs w:val="28"/>
+        </w:rPr>
+        <w:drawing>
+          <wp:inline distT="0" distB="0" distL="0" distR="0" wp14:anchorId="28F981E3" wp14:editId="6BDB18CD">
+            <wp:extent cx="4641215" cy="2506717"/>
+            <wp:effectExtent l="0" t="0" r="6985" b="8255"/>
+            <wp:docPr id="6" name="Picture 6"/>
+            <wp:cNvGraphicFramePr>
+              <a:graphicFrameLocks xmlns:a="http://schemas.openxmlformats.org/drawingml/2006/main" noChangeAspect="1"/>
+            </wp:cNvGraphicFramePr>
+            <a:graphic xmlns:a="http://schemas.openxmlformats.org/drawingml/2006/main">
+              <a:graphicData uri="http://schemas.openxmlformats.org/drawingml/2006/picture">
+                <pic:pic xmlns:pic="http://schemas.openxmlformats.org/drawingml/2006/picture">
+                  <pic:nvPicPr>
+                    <pic:cNvPr id="6" name="Heat_mode_Ready-REST_icon.jpg"/>
+                    <pic:cNvPicPr/>
+                  </pic:nvPicPr>
+                  <pic:blipFill>
+                    <a:blip r:embed="rId13" cstate="print">
+                      <a:extLst>
+                        <a:ext uri="{28A0092B-C50C-407E-A947-70E740481C1C}">
+                          <a14:useLocalDpi xmlns:a14="http://schemas.microsoft.com/office/drawing/2010/main" val="0"/>
+                        </a:ext>
+                      </a:extLst>
+                    </a:blip>
+                    <a:stretch>
+                      <a:fillRect/>
+                    </a:stretch>
+                  </pic:blipFill>
+                  <pic:spPr>
+                    <a:xfrm>
+                      <a:off x="0" y="0"/>
+                      <a:ext cx="4690210" cy="2533179"/>
+                    </a:xfrm>
+                    <a:prstGeom prst="rect">
+                      <a:avLst/>
+                    </a:prstGeom>
+                  </pic:spPr>
+                </pic:pic>
+              </a:graphicData>
+            </a:graphic>
+          </wp:inline>
+        </w:drawing>
+      </w:r>
+    </w:p>
+    <w:p>
+      <w:pPr>
+        <w:spacing w:line="240" w:lineRule="auto"/>
+        <w:jc w:val="both"/>
+        <w:rPr>
+          <w:rFonts w:cstheme="minorHAnsi"/>
+          <w:b/>
+          <w:sz w:val="28"/>
+          <w:szCs w:val="28"/>
+        </w:rPr>
+      </w:pPr>
+      <w:r>
+        <w:rPr>
+          <w:rFonts w:cstheme="minorHAnsi"/>
+          <w:b/>
+          <w:sz w:val="28"/>
+          <w:szCs w:val="28"/>
+        </w:rPr>
+        <w:lastRenderedPageBreak/>
         <w:t>Temperature:</w:t>
       </w:r>
     </w:p>
@@ -703,7 +1261,7 @@
           <w:sz w:val="28"/>
           <w:szCs w:val="28"/>
         </w:rPr>
-        <w:t>MEASURED TEMPERATURE/CURRENT TEMPERATURE</w:t>
+        <w:t>CURRENT TEMPERATURE</w:t>
       </w:r>
       <w:r>
         <w:rPr>
@@ -751,23 +1309,24 @@
           <w:sz w:val="28"/>
           <w:szCs w:val="28"/>
         </w:rPr>
-        <w:t xml:space="preserve">Set Temp Increase arrow – on the Top of </w:t>
-      </w:r>
-      <w:r>
-        <w:rPr>
-          <w:rFonts w:cstheme="minorHAnsi"/>
-          <w:sz w:val="28"/>
-          <w:szCs w:val="28"/>
-        </w:rPr>
-        <w:t>it</w:t>
-      </w:r>
-      <w:r>
-        <w:rPr>
-          <w:rFonts w:cstheme="minorHAnsi"/>
-          <w:sz w:val="28"/>
-          <w:szCs w:val="28"/>
-        </w:rPr>
-        <w:t>.</w:t>
+        <w:t xml:space="preserve">Up Arrow – Increase </w:t>
+      </w:r>
+      <w:r>
+        <w:rPr>
+          <w:rFonts w:cstheme="minorHAnsi"/>
+          <w:color w:val="FFC000"/>
+          <w:sz w:val="28"/>
+          <w:szCs w:val="28"/>
+        </w:rPr>
+        <w:t>Set Temp</w:t>
+      </w:r>
+      <w:r>
+        <w:rPr>
+          <w:rFonts w:cstheme="minorHAnsi"/>
+          <w:sz w:val="28"/>
+          <w:szCs w:val="28"/>
+        </w:rPr>
+        <w:t xml:space="preserve"> by 0.5 Degree</w:t>
       </w:r>
     </w:p>
     <w:p>
@@ -791,23 +1350,188 @@
           <w:sz w:val="28"/>
           <w:szCs w:val="28"/>
         </w:rPr>
-        <w:t xml:space="preserve">Set Temp Decrease arrow – on the Bottom of </w:t>
-      </w:r>
-      <w:r>
-        <w:rPr>
-          <w:rFonts w:cstheme="minorHAnsi"/>
-          <w:sz w:val="28"/>
-          <w:szCs w:val="28"/>
-        </w:rPr>
-        <w:t>it</w:t>
-      </w:r>
-      <w:r>
-        <w:rPr>
-          <w:rFonts w:cstheme="minorHAnsi"/>
-          <w:sz w:val="28"/>
-          <w:szCs w:val="28"/>
-        </w:rPr>
-        <w:t>.</w:t>
+        <w:t xml:space="preserve">Down Arrow – Decrease </w:t>
+      </w:r>
+      <w:r>
+        <w:rPr>
+          <w:rFonts w:cstheme="minorHAnsi"/>
+          <w:color w:val="FFC000"/>
+          <w:sz w:val="28"/>
+          <w:szCs w:val="28"/>
+        </w:rPr>
+        <w:t>Set Temp</w:t>
+      </w:r>
+      <w:r>
+        <w:rPr>
+          <w:rFonts w:cstheme="minorHAnsi"/>
+          <w:sz w:val="28"/>
+          <w:szCs w:val="28"/>
+        </w:rPr>
+        <w:t xml:space="preserve"> by </w:t>
+      </w:r>
+      <w:r>
+        <w:rPr>
+          <w:rFonts w:cstheme="minorHAnsi"/>
+          <w:sz w:val="28"/>
+          <w:szCs w:val="28"/>
+        </w:rPr>
+        <w:t>0.5 degree</w:t>
+      </w:r>
+    </w:p>
+    <w:p>
+      <w:pPr>
+        <w:pStyle w:val="ListParagraph"/>
+        <w:numPr>
+          <w:ilvl w:val="0"/>
+          <w:numId w:val="2"/>
+        </w:numPr>
+        <w:spacing w:line="240" w:lineRule="auto"/>
+        <w:jc w:val="both"/>
+        <w:rPr>
+          <w:rFonts w:cstheme="minorHAnsi"/>
+          <w:sz w:val="28"/>
+          <w:szCs w:val="28"/>
+        </w:rPr>
+      </w:pPr>
+      <w:r>
+        <w:rPr>
+          <w:rFonts w:cstheme="minorHAnsi"/>
+          <w:color w:val="FFC000"/>
+          <w:sz w:val="28"/>
+          <w:szCs w:val="28"/>
+        </w:rPr>
+        <w:t>“</w:t>
+      </w:r>
+      <w:r>
+        <w:rPr>
+          <w:rFonts w:cstheme="minorHAnsi"/>
+          <w:color w:val="FFC000"/>
+          <w:sz w:val="28"/>
+          <w:szCs w:val="28"/>
+        </w:rPr>
+        <w:t>SET TEMPERATUR</w:t>
+      </w:r>
+      <w:r>
+        <w:rPr>
+          <w:rFonts w:cstheme="minorHAnsi"/>
+          <w:color w:val="FFC000"/>
+          <w:sz w:val="28"/>
+          <w:szCs w:val="28"/>
+        </w:rPr>
+        <w:t>E”</w:t>
+      </w:r>
+      <w:r>
+        <w:rPr>
+          <w:rFonts w:cstheme="minorHAnsi"/>
+          <w:sz w:val="28"/>
+          <w:szCs w:val="28"/>
+        </w:rPr>
+        <w:t xml:space="preserve"> will be shown in </w:t>
+      </w:r>
+      <w:r>
+        <w:rPr>
+          <w:rFonts w:cstheme="minorHAnsi"/>
+          <w:color w:val="FFC000"/>
+          <w:sz w:val="28"/>
+          <w:szCs w:val="28"/>
+        </w:rPr>
+        <w:t>Y</w:t>
+      </w:r>
+      <w:r>
+        <w:rPr>
+          <w:rFonts w:cstheme="minorHAnsi"/>
+          <w:color w:val="FFC000"/>
+          <w:sz w:val="28"/>
+          <w:szCs w:val="28"/>
+        </w:rPr>
+        <w:t xml:space="preserve">ellow </w:t>
+      </w:r>
+      <w:r>
+        <w:rPr>
+          <w:rFonts w:cstheme="minorHAnsi"/>
+          <w:color w:val="FFC000"/>
+          <w:sz w:val="28"/>
+          <w:szCs w:val="28"/>
+        </w:rPr>
+        <w:t>C</w:t>
+      </w:r>
+      <w:r>
+        <w:rPr>
+          <w:rFonts w:cstheme="minorHAnsi"/>
+          <w:color w:val="FFC000"/>
+          <w:sz w:val="28"/>
+          <w:szCs w:val="28"/>
+        </w:rPr>
+        <w:t>olour</w:t>
+      </w:r>
+      <w:r>
+        <w:rPr>
+          <w:rFonts w:cstheme="minorHAnsi"/>
+          <w:sz w:val="28"/>
+          <w:szCs w:val="28"/>
+        </w:rPr>
+        <w:t xml:space="preserve">, while </w:t>
+      </w:r>
+      <w:r>
+        <w:rPr>
+          <w:rFonts w:cstheme="minorHAnsi"/>
+          <w:sz w:val="28"/>
+          <w:szCs w:val="28"/>
+        </w:rPr>
+        <w:t>setting the temp</w:t>
+      </w:r>
+      <w:r>
+        <w:rPr>
+          <w:rFonts w:cstheme="minorHAnsi"/>
+          <w:sz w:val="28"/>
+          <w:szCs w:val="28"/>
+        </w:rPr>
+        <w:t>, for a brief period of time</w:t>
+      </w:r>
+    </w:p>
+    <w:p>
+      <w:pPr>
+        <w:spacing w:line="240" w:lineRule="auto"/>
+        <w:jc w:val="both"/>
+        <w:rPr>
+          <w:rFonts w:cstheme="minorHAnsi"/>
+          <w:b/>
+          <w:sz w:val="28"/>
+          <w:szCs w:val="28"/>
+        </w:rPr>
+      </w:pPr>
+      <w:r>
+        <w:rPr>
+          <w:rFonts w:cstheme="minorHAnsi"/>
+          <w:b/>
+          <w:sz w:val="28"/>
+          <w:szCs w:val="28"/>
+        </w:rPr>
+        <w:t>Temperature Range:</w:t>
+      </w:r>
+    </w:p>
+    <w:p>
+      <w:pPr>
+        <w:pStyle w:val="ListParagraph"/>
+        <w:numPr>
+          <w:ilvl w:val="0"/>
+          <w:numId w:val="2"/>
+        </w:numPr>
+        <w:spacing w:line="240" w:lineRule="auto"/>
+        <w:jc w:val="both"/>
+        <w:rPr>
+          <w:rFonts w:cstheme="minorHAnsi"/>
+          <w:sz w:val="28"/>
+          <w:szCs w:val="28"/>
+        </w:rPr>
+      </w:pPr>
+      <w:r>
+        <w:rPr>
+          <w:rFonts w:cstheme="minorHAnsi"/>
+          <w:sz w:val="28"/>
+          <w:szCs w:val="28"/>
+        </w:rPr>
+        <w:t>LOW</w:t>
       </w:r>
     </w:p>
     <w:p>
@@ -831,39 +1555,55 @@
           <w:sz w:val="28"/>
           <w:szCs w:val="28"/>
         </w:rPr>
-        <w:t xml:space="preserve">Single press </w:t>
-      </w:r>
-      <w:r>
-        <w:rPr>
-          <w:rFonts w:cstheme="minorHAnsi"/>
-          <w:sz w:val="28"/>
-          <w:szCs w:val="28"/>
-        </w:rPr>
-        <w:t xml:space="preserve">on arrow -&gt; </w:t>
-      </w:r>
-      <w:r>
-        <w:rPr>
-          <w:rFonts w:cstheme="minorHAnsi"/>
-          <w:sz w:val="28"/>
-          <w:szCs w:val="28"/>
-        </w:rPr>
-        <w:t>0.5 degrees</w:t>
-      </w:r>
-      <w:r>
-        <w:rPr>
-          <w:rFonts w:cstheme="minorHAnsi"/>
-          <w:sz w:val="28"/>
-          <w:szCs w:val="28"/>
-        </w:rPr>
-        <w:t xml:space="preserve"> change</w:t>
-      </w:r>
-      <w:r>
-        <w:rPr>
-          <w:rFonts w:cstheme="minorHAnsi"/>
-          <w:sz w:val="28"/>
-          <w:szCs w:val="28"/>
-        </w:rPr>
-        <w:t>.</w:t>
+        <w:t>Set temp</w:t>
+      </w:r>
+      <w:r>
+        <w:rPr>
+          <w:rFonts w:cstheme="minorHAnsi"/>
+          <w:sz w:val="28"/>
+          <w:szCs w:val="28"/>
+        </w:rPr>
+        <w:t xml:space="preserve"> from</w:t>
+      </w:r>
+      <w:r>
+        <w:rPr>
+          <w:rFonts w:cstheme="minorHAnsi"/>
+          <w:sz w:val="28"/>
+          <w:szCs w:val="28"/>
+        </w:rPr>
+        <w:t xml:space="preserve"> </w:t>
+      </w:r>
+      <w:r>
+        <w:rPr>
+          <w:rFonts w:cstheme="minorHAnsi"/>
+          <w:sz w:val="28"/>
+          <w:szCs w:val="28"/>
+        </w:rPr>
+        <w:t>10 to 37 degrees</w:t>
+      </w:r>
+    </w:p>
+    <w:p>
+      <w:pPr>
+        <w:pStyle w:val="ListParagraph"/>
+        <w:numPr>
+          <w:ilvl w:val="0"/>
+          <w:numId w:val="2"/>
+        </w:numPr>
+        <w:spacing w:line="240" w:lineRule="auto"/>
+        <w:jc w:val="both"/>
+        <w:rPr>
+          <w:rFonts w:cstheme="minorHAnsi"/>
+          <w:sz w:val="28"/>
+          <w:szCs w:val="28"/>
+        </w:rPr>
+      </w:pPr>
+      <w:r>
+        <w:rPr>
+          <w:rFonts w:cstheme="minorHAnsi"/>
+          <w:sz w:val="28"/>
+          <w:szCs w:val="28"/>
+        </w:rPr>
+        <w:t>HIGH</w:t>
       </w:r>
     </w:p>
     <w:p>
@@ -887,119 +1627,70 @@
           <w:sz w:val="28"/>
           <w:szCs w:val="28"/>
         </w:rPr>
-        <w:t>S</w:t>
-      </w:r>
-      <w:r>
-        <w:rPr>
-          <w:rFonts w:cstheme="minorHAnsi"/>
-          <w:sz w:val="28"/>
-          <w:szCs w:val="28"/>
-        </w:rPr>
-        <w:t xml:space="preserve">et </w:t>
-      </w:r>
-      <w:r>
-        <w:rPr>
-          <w:rFonts w:cstheme="minorHAnsi"/>
-          <w:sz w:val="28"/>
-          <w:szCs w:val="28"/>
-        </w:rPr>
-        <w:t>Temperature</w:t>
-      </w:r>
-      <w:r>
-        <w:rPr>
-          <w:rFonts w:cstheme="minorHAnsi"/>
-          <w:sz w:val="28"/>
-          <w:szCs w:val="28"/>
-        </w:rPr>
-        <w:t xml:space="preserve"> will be shown in </w:t>
-      </w:r>
-      <w:r>
-        <w:rPr>
-          <w:rFonts w:cstheme="minorHAnsi"/>
-          <w:sz w:val="28"/>
-          <w:szCs w:val="28"/>
-        </w:rPr>
-        <w:t>Y</w:t>
-      </w:r>
-      <w:r>
-        <w:rPr>
-          <w:rFonts w:cstheme="minorHAnsi"/>
-          <w:sz w:val="28"/>
-          <w:szCs w:val="28"/>
-        </w:rPr>
-        <w:t xml:space="preserve">ellow </w:t>
-      </w:r>
-      <w:r>
-        <w:rPr>
-          <w:rFonts w:cstheme="minorHAnsi"/>
-          <w:sz w:val="28"/>
-          <w:szCs w:val="28"/>
-        </w:rPr>
-        <w:t>C</w:t>
-      </w:r>
-      <w:r>
-        <w:rPr>
-          <w:rFonts w:cstheme="minorHAnsi"/>
-          <w:sz w:val="28"/>
-          <w:szCs w:val="28"/>
-        </w:rPr>
-        <w:t>olour</w:t>
-      </w:r>
-      <w:r>
-        <w:rPr>
-          <w:rFonts w:cstheme="minorHAnsi"/>
-          <w:sz w:val="28"/>
-          <w:szCs w:val="28"/>
-        </w:rPr>
-        <w:t xml:space="preserve">, while </w:t>
-      </w:r>
-      <w:r>
-        <w:rPr>
-          <w:rFonts w:cstheme="minorHAnsi"/>
-          <w:sz w:val="28"/>
-          <w:szCs w:val="28"/>
-        </w:rPr>
-        <w:t>setting the temp</w:t>
-      </w:r>
-      <w:r>
-        <w:rPr>
-          <w:rFonts w:cstheme="minorHAnsi"/>
-          <w:sz w:val="28"/>
-          <w:szCs w:val="28"/>
-        </w:rPr>
-        <w:t>, for a brief period of time</w:t>
-      </w:r>
-      <w:r>
-        <w:rPr>
-          <w:rFonts w:cstheme="minorHAnsi"/>
-          <w:sz w:val="28"/>
-          <w:szCs w:val="28"/>
-        </w:rPr>
-        <w:t>.</w:t>
-      </w:r>
-    </w:p>
-    <w:p>
-      <w:pPr>
-        <w:spacing w:line="240" w:lineRule="auto"/>
-        <w:jc w:val="both"/>
-        <w:rPr>
-          <w:rFonts w:cstheme="minorHAnsi"/>
-          <w:b/>
-          <w:sz w:val="28"/>
-          <w:szCs w:val="28"/>
-        </w:rPr>
-      </w:pPr>
-      <w:r>
-        <w:rPr>
-          <w:rFonts w:cstheme="minorHAnsi"/>
-          <w:b/>
-          <w:sz w:val="28"/>
-          <w:szCs w:val="28"/>
-        </w:rPr>
-        <w:t>Temperature Range:</w:t>
-      </w:r>
-      <w:bookmarkStart w:id="0" w:name="_GoBack"/>
-      <w:bookmarkEnd w:id="0"/>
+        <w:t xml:space="preserve">Set temp </w:t>
+      </w:r>
+      <w:r>
+        <w:rPr>
+          <w:rFonts w:cstheme="minorHAnsi"/>
+          <w:sz w:val="28"/>
+          <w:szCs w:val="28"/>
+        </w:rPr>
+        <w:t>from</w:t>
+      </w:r>
+      <w:r>
+        <w:rPr>
+          <w:rFonts w:cstheme="minorHAnsi"/>
+          <w:sz w:val="28"/>
+          <w:szCs w:val="28"/>
+        </w:rPr>
+        <w:t xml:space="preserve"> </w:t>
+      </w:r>
+      <w:r>
+        <w:rPr>
+          <w:rFonts w:cstheme="minorHAnsi"/>
+          <w:sz w:val="28"/>
+          <w:szCs w:val="28"/>
+        </w:rPr>
+        <w:t xml:space="preserve"> </w:t>
+      </w:r>
+      <w:r>
+        <w:rPr>
+          <w:rFonts w:cstheme="minorHAnsi"/>
+          <w:sz w:val="28"/>
+          <w:szCs w:val="28"/>
+        </w:rPr>
+        <w:t>26.5 to 40 degrees</w:t>
+      </w:r>
+    </w:p>
+    <w:p>
+      <w:pPr>
+        <w:spacing w:line="240" w:lineRule="auto"/>
+        <w:jc w:val="both"/>
+        <w:rPr>
+          <w:rFonts w:cstheme="minorHAnsi"/>
+          <w:b/>
+          <w:sz w:val="28"/>
+          <w:szCs w:val="28"/>
+        </w:rPr>
+      </w:pPr>
+      <w:r>
+        <w:rPr>
+          <w:rFonts w:cstheme="minorHAnsi"/>
+          <w:b/>
+          <w:sz w:val="28"/>
+          <w:szCs w:val="28"/>
+        </w:rPr>
+        <w:t>Heat Mode:</w:t>
+      </w:r>
+      <w:r>
+        <w:rPr>
+          <w:rFonts w:cstheme="minorHAnsi"/>
+          <w:b/>
+          <w:sz w:val="28"/>
+          <w:szCs w:val="28"/>
+        </w:rPr>
+        <w:tab/>
+      </w:r>
     </w:p>
     <w:p>
       <w:pPr>
@@ -1012,25 +1703,34 @@
         <w:jc w:val="both"/>
         <w:rPr>
           <w:rFonts w:cstheme="minorHAnsi"/>
-          <w:sz w:val="28"/>
-          <w:szCs w:val="28"/>
-        </w:rPr>
-      </w:pPr>
-      <w:r>
-        <w:rPr>
-          <w:rFonts w:cstheme="minorHAnsi"/>
-          <w:sz w:val="28"/>
-          <w:szCs w:val="28"/>
-        </w:rPr>
-        <w:t xml:space="preserve">Temp Range </w:t>
-      </w:r>
-      <w:r>
-        <w:rPr>
-          <w:rFonts w:cstheme="minorHAnsi"/>
-          <w:sz w:val="28"/>
-          <w:szCs w:val="28"/>
-        </w:rPr>
-        <w:t>LOW</w:t>
+          <w:b/>
+          <w:sz w:val="28"/>
+          <w:szCs w:val="28"/>
+        </w:rPr>
+      </w:pPr>
+      <w:r>
+        <w:rPr>
+          <w:rFonts w:cstheme="minorHAnsi"/>
+          <w:sz w:val="28"/>
+          <w:szCs w:val="28"/>
+        </w:rPr>
+        <w:t xml:space="preserve"> “</w:t>
+      </w:r>
+      <w:r>
+        <w:rPr>
+          <w:rFonts w:cstheme="minorHAnsi"/>
+          <w:sz w:val="28"/>
+          <w:szCs w:val="28"/>
+        </w:rPr>
+        <w:t>READY</w:t>
+      </w:r>
+      <w:r>
+        <w:rPr>
+          <w:rFonts w:cstheme="minorHAnsi"/>
+          <w:sz w:val="28"/>
+          <w:szCs w:val="28"/>
+        </w:rPr>
+        <w:t>”</w:t>
       </w:r>
       <w:r>
         <w:rPr>
@@ -1040,6 +1740,153 @@
         </w:rPr>
         <w:t>.</w:t>
       </w:r>
+      <w:r>
+        <w:rPr>
+          <w:rFonts w:cstheme="minorHAnsi"/>
+          <w:sz w:val="28"/>
+          <w:szCs w:val="28"/>
+        </w:rPr>
+        <w:t xml:space="preserve"> </w:t>
+      </w:r>
+      <w:r>
+        <w:rPr>
+          <w:rFonts w:cstheme="minorHAnsi"/>
+          <w:sz w:val="28"/>
+          <w:szCs w:val="28"/>
+        </w:rPr>
+        <w:t>(</w:t>
+      </w:r>
+      <w:r>
+        <w:rPr>
+          <w:rFonts w:cstheme="minorHAnsi"/>
+          <w:b/>
+          <w:sz w:val="28"/>
+          <w:szCs w:val="28"/>
+        </w:rPr>
+        <w:t xml:space="preserve">Heating </w:t>
+      </w:r>
+      <w:r>
+        <w:rPr>
+          <w:rFonts w:cstheme="minorHAnsi"/>
+          <w:b/>
+          <w:sz w:val="28"/>
+          <w:szCs w:val="28"/>
+        </w:rPr>
+        <w:t>States</w:t>
+      </w:r>
+      <w:r>
+        <w:rPr>
+          <w:rFonts w:cstheme="minorHAnsi"/>
+          <w:sz w:val="28"/>
+          <w:szCs w:val="28"/>
+        </w:rPr>
+        <w:t xml:space="preserve">: </w:t>
+      </w:r>
+      <w:r>
+        <w:rPr>
+          <w:rFonts w:cstheme="minorHAnsi"/>
+          <w:sz w:val="28"/>
+          <w:szCs w:val="28"/>
+        </w:rPr>
+        <w:t>“NOT HEATING”</w:t>
+      </w:r>
+      <w:r>
+        <w:rPr>
+          <w:rFonts w:cstheme="minorHAnsi"/>
+          <w:sz w:val="28"/>
+          <w:szCs w:val="28"/>
+        </w:rPr>
+        <w:t xml:space="preserve">, </w:t>
+      </w:r>
+      <w:r>
+        <w:rPr>
+          <w:rFonts w:cstheme="minorHAnsi"/>
+          <w:sz w:val="28"/>
+          <w:szCs w:val="28"/>
+        </w:rPr>
+        <w:t>“HEATING’</w:t>
+      </w:r>
+      <w:r>
+        <w:rPr>
+          <w:rFonts w:cstheme="minorHAnsi"/>
+          <w:sz w:val="28"/>
+          <w:szCs w:val="28"/>
+        </w:rPr>
+        <w:t xml:space="preserve"> </w:t>
+      </w:r>
+      <w:r>
+        <w:rPr>
+          <w:rFonts w:cstheme="minorHAnsi"/>
+          <w:sz w:val="28"/>
+          <w:szCs w:val="28"/>
+        </w:rPr>
+        <w:t>&amp; “HEAT WAITING”)</w:t>
+      </w:r>
+    </w:p>
+    <w:p>
+      <w:pPr>
+        <w:pStyle w:val="ListParagraph"/>
+        <w:spacing w:line="240" w:lineRule="auto"/>
+        <w:jc w:val="center"/>
+        <w:rPr>
+          <w:rFonts w:cstheme="minorHAnsi"/>
+          <w:b/>
+          <w:sz w:val="28"/>
+          <w:szCs w:val="28"/>
+        </w:rPr>
+      </w:pPr>
+      <w:bookmarkStart w:id="0" w:name="_GoBack"/>
+      <w:r>
+        <w:rPr>
+          <w:rFonts w:cstheme="minorHAnsi"/>
+          <w:b/>
+          <w:noProof/>
+          <w:sz w:val="28"/>
+          <w:szCs w:val="28"/>
+        </w:rPr>
+        <w:drawing>
+          <wp:inline distT="0" distB="0" distL="0" distR="0" wp14:anchorId="361153DF" wp14:editId="0DD3287F">
+            <wp:extent cx="5313045" cy="3228975"/>
+            <wp:effectExtent l="0" t="0" r="1905" b="9525"/>
+            <wp:docPr id="7" name="Picture 7"/>
+            <wp:cNvGraphicFramePr>
+              <a:graphicFrameLocks xmlns:a="http://schemas.openxmlformats.org/drawingml/2006/main" noChangeAspect="1"/>
+            </wp:cNvGraphicFramePr>
+            <a:graphic xmlns:a="http://schemas.openxmlformats.org/drawingml/2006/main">
+              <a:graphicData uri="http://schemas.openxmlformats.org/drawingml/2006/picture">
+                <pic:pic xmlns:pic="http://schemas.openxmlformats.org/drawingml/2006/picture">
+                  <pic:nvPicPr>
+                    <pic:cNvPr id="7" name="Heating_state_icon.jpg"/>
+                    <pic:cNvPicPr/>
+                  </pic:nvPicPr>
+                  <pic:blipFill>
+                    <a:blip r:embed="rId14" cstate="print">
+                      <a:extLst>
+                        <a:ext uri="{28A0092B-C50C-407E-A947-70E740481C1C}">
+                          <a14:useLocalDpi xmlns:a14="http://schemas.microsoft.com/office/drawing/2010/main" val="0"/>
+                        </a:ext>
+                      </a:extLst>
+                    </a:blip>
+                    <a:stretch>
+                      <a:fillRect/>
+                    </a:stretch>
+                  </pic:blipFill>
+                  <pic:spPr>
+                    <a:xfrm>
+                      <a:off x="0" y="0"/>
+                      <a:ext cx="5354245" cy="3254014"/>
+                    </a:xfrm>
+                    <a:prstGeom prst="rect">
+                      <a:avLst/>
+                    </a:prstGeom>
+                  </pic:spPr>
+                </pic:pic>
+              </a:graphicData>
+            </a:graphic>
+          </wp:inline>
+        </w:drawing>
+      </w:r>
+      <w:bookmarkEnd w:id="0"/>
     </w:p>
     <w:p>
       <w:pPr>
@@ -1052,6 +1899,388 @@
         <w:jc w:val="both"/>
         <w:rPr>
           <w:rFonts w:cstheme="minorHAnsi"/>
+          <w:b/>
+          <w:sz w:val="28"/>
+          <w:szCs w:val="28"/>
+        </w:rPr>
+      </w:pPr>
+      <w:r>
+        <w:rPr>
+          <w:rFonts w:cstheme="minorHAnsi"/>
+          <w:sz w:val="28"/>
+          <w:szCs w:val="28"/>
+        </w:rPr>
+        <w:t>Measured Temp &lt; Set Temp by 1 Degree or more</w:t>
+      </w:r>
+    </w:p>
+    <w:p>
+      <w:pPr>
+        <w:pStyle w:val="ListParagraph"/>
+        <w:numPr>
+          <w:ilvl w:val="2"/>
+          <w:numId w:val="2"/>
+        </w:numPr>
+        <w:spacing w:line="240" w:lineRule="auto"/>
+        <w:jc w:val="both"/>
+        <w:rPr>
+          <w:rFonts w:cstheme="minorHAnsi"/>
+          <w:b/>
+          <w:sz w:val="28"/>
+          <w:szCs w:val="28"/>
+        </w:rPr>
+      </w:pPr>
+      <w:r>
+        <w:rPr>
+          <w:rFonts w:cstheme="minorHAnsi"/>
+          <w:sz w:val="28"/>
+          <w:szCs w:val="28"/>
+        </w:rPr>
+        <w:t>HEATING</w:t>
+      </w:r>
+    </w:p>
+    <w:p>
+      <w:pPr>
+        <w:pStyle w:val="ListParagraph"/>
+        <w:numPr>
+          <w:ilvl w:val="3"/>
+          <w:numId w:val="2"/>
+        </w:numPr>
+        <w:spacing w:line="240" w:lineRule="auto"/>
+        <w:jc w:val="both"/>
+        <w:rPr>
+          <w:rFonts w:cstheme="minorHAnsi"/>
+          <w:b/>
+          <w:sz w:val="28"/>
+          <w:szCs w:val="28"/>
+        </w:rPr>
+      </w:pPr>
+      <w:r>
+        <w:rPr>
+          <w:rFonts w:cstheme="minorHAnsi"/>
+          <w:sz w:val="28"/>
+          <w:szCs w:val="28"/>
+        </w:rPr>
+        <w:t>Red</w:t>
+      </w:r>
+      <w:r>
+        <w:rPr>
+          <w:rFonts w:cstheme="minorHAnsi"/>
+          <w:color w:val="FF0000"/>
+          <w:sz w:val="28"/>
+          <w:szCs w:val="28"/>
+        </w:rPr>
+        <w:t xml:space="preserve"> </w:t>
+      </w:r>
+      <w:r>
+        <w:rPr>
+          <w:rFonts w:cstheme="minorHAnsi"/>
+          <w:color w:val="FF0000"/>
+          <w:sz w:val="28"/>
+          <w:szCs w:val="28"/>
+        </w:rPr>
+        <w:t>“Thermometer with Increasing Temperature”</w:t>
+      </w:r>
+      <w:r>
+        <w:rPr>
+          <w:rFonts w:cstheme="minorHAnsi"/>
+          <w:sz w:val="28"/>
+          <w:szCs w:val="28"/>
+        </w:rPr>
+        <w:t xml:space="preserve"> icon</w:t>
+      </w:r>
+    </w:p>
+    <w:p>
+      <w:pPr>
+        <w:pStyle w:val="ListParagraph"/>
+        <w:numPr>
+          <w:ilvl w:val="2"/>
+          <w:numId w:val="2"/>
+        </w:numPr>
+        <w:spacing w:line="240" w:lineRule="auto"/>
+        <w:jc w:val="both"/>
+        <w:rPr>
+          <w:rFonts w:cstheme="minorHAnsi"/>
+          <w:b/>
+          <w:sz w:val="28"/>
+          <w:szCs w:val="28"/>
+        </w:rPr>
+      </w:pPr>
+      <w:r>
+        <w:rPr>
+          <w:rFonts w:cstheme="minorHAnsi"/>
+          <w:sz w:val="28"/>
+          <w:szCs w:val="28"/>
+        </w:rPr>
+        <w:t>HEAT WAITING</w:t>
+      </w:r>
+      <w:r>
+        <w:rPr>
+          <w:rFonts w:cstheme="minorHAnsi"/>
+          <w:sz w:val="28"/>
+          <w:szCs w:val="28"/>
+        </w:rPr>
+        <w:t xml:space="preserve"> –</w:t>
+      </w:r>
+      <w:r>
+        <w:rPr>
+          <w:rFonts w:cstheme="minorHAnsi"/>
+          <w:sz w:val="28"/>
+          <w:szCs w:val="28"/>
+        </w:rPr>
+        <w:t xml:space="preserve"> </w:t>
+      </w:r>
+      <w:r>
+        <w:rPr>
+          <w:rFonts w:cstheme="minorHAnsi"/>
+          <w:sz w:val="28"/>
+          <w:szCs w:val="28"/>
+        </w:rPr>
+        <w:t xml:space="preserve">for </w:t>
+      </w:r>
+      <w:r>
+        <w:rPr>
+          <w:rFonts w:cstheme="minorHAnsi"/>
+          <w:sz w:val="28"/>
+          <w:szCs w:val="28"/>
+        </w:rPr>
+        <w:t>1</w:t>
+      </w:r>
+      <w:r>
+        <w:rPr>
+          <w:rFonts w:cstheme="minorHAnsi"/>
+          <w:sz w:val="28"/>
+          <w:szCs w:val="28"/>
+        </w:rPr>
+        <w:t>-</w:t>
+      </w:r>
+      <w:r>
+        <w:rPr>
+          <w:rFonts w:cstheme="minorHAnsi"/>
+          <w:sz w:val="28"/>
+          <w:szCs w:val="28"/>
+        </w:rPr>
+        <w:t>2 Min</w:t>
+      </w:r>
+    </w:p>
+    <w:p>
+      <w:pPr>
+        <w:pStyle w:val="ListParagraph"/>
+        <w:numPr>
+          <w:ilvl w:val="3"/>
+          <w:numId w:val="2"/>
+        </w:numPr>
+        <w:spacing w:line="240" w:lineRule="auto"/>
+        <w:jc w:val="both"/>
+        <w:rPr>
+          <w:rFonts w:cstheme="minorHAnsi"/>
+          <w:b/>
+          <w:sz w:val="28"/>
+          <w:szCs w:val="28"/>
+        </w:rPr>
+      </w:pPr>
+      <w:r>
+        <w:rPr>
+          <w:rFonts w:cstheme="minorHAnsi"/>
+          <w:sz w:val="28"/>
+          <w:szCs w:val="28"/>
+        </w:rPr>
+        <w:t>Red</w:t>
+      </w:r>
+      <w:r>
+        <w:rPr>
+          <w:rFonts w:cstheme="minorHAnsi"/>
+          <w:color w:val="FF0000"/>
+          <w:sz w:val="28"/>
+          <w:szCs w:val="28"/>
+        </w:rPr>
+        <w:t xml:space="preserve"> </w:t>
+      </w:r>
+      <w:r>
+        <w:rPr>
+          <w:rFonts w:cstheme="minorHAnsi"/>
+          <w:color w:val="FF0000"/>
+          <w:sz w:val="28"/>
+          <w:szCs w:val="28"/>
+        </w:rPr>
+        <w:t>“Blinking Thermometer”</w:t>
+      </w:r>
+      <w:r>
+        <w:rPr>
+          <w:rFonts w:cstheme="minorHAnsi"/>
+          <w:sz w:val="28"/>
+          <w:szCs w:val="28"/>
+        </w:rPr>
+        <w:t xml:space="preserve"> icon</w:t>
+      </w:r>
+    </w:p>
+    <w:p>
+      <w:pPr>
+        <w:pStyle w:val="ListParagraph"/>
+        <w:numPr>
+          <w:ilvl w:val="2"/>
+          <w:numId w:val="5"/>
+        </w:numPr>
+        <w:spacing w:line="240" w:lineRule="auto"/>
+        <w:jc w:val="both"/>
+        <w:rPr>
+          <w:rFonts w:cstheme="minorHAnsi"/>
+          <w:sz w:val="28"/>
+          <w:szCs w:val="28"/>
+        </w:rPr>
+      </w:pPr>
+      <w:r>
+        <w:rPr>
+          <w:rFonts w:cstheme="minorHAnsi"/>
+          <w:sz w:val="28"/>
+          <w:szCs w:val="28"/>
+        </w:rPr>
+        <w:t>Heating State again</w:t>
+      </w:r>
+      <w:r>
+        <w:rPr>
+          <w:rFonts w:cstheme="minorHAnsi"/>
+          <w:sz w:val="28"/>
+          <w:szCs w:val="28"/>
+        </w:rPr>
+        <w:t>; Until current temp reaches to Set temp</w:t>
+      </w:r>
+    </w:p>
+    <w:p>
+      <w:pPr>
+        <w:pStyle w:val="ListParagraph"/>
+        <w:numPr>
+          <w:ilvl w:val="1"/>
+          <w:numId w:val="2"/>
+        </w:numPr>
+        <w:spacing w:line="240" w:lineRule="auto"/>
+        <w:jc w:val="both"/>
+        <w:rPr>
+          <w:rFonts w:cstheme="minorHAnsi"/>
+          <w:sz w:val="28"/>
+          <w:szCs w:val="28"/>
+        </w:rPr>
+      </w:pPr>
+      <w:r>
+        <w:rPr>
+          <w:rFonts w:cstheme="minorHAnsi"/>
+          <w:sz w:val="28"/>
+          <w:szCs w:val="28"/>
+        </w:rPr>
+        <w:t xml:space="preserve">Measured Temperature </w:t>
+      </w:r>
+      <w:r>
+        <w:rPr>
+          <w:rFonts w:cstheme="minorHAnsi"/>
+          <w:sz w:val="28"/>
+          <w:szCs w:val="28"/>
+        </w:rPr>
+        <w:t xml:space="preserve">&gt; </w:t>
+      </w:r>
+      <w:r>
+        <w:rPr>
+          <w:rFonts w:cstheme="minorHAnsi"/>
+          <w:sz w:val="28"/>
+          <w:szCs w:val="28"/>
+        </w:rPr>
+        <w:t>Set Temperature</w:t>
+      </w:r>
+      <w:r>
+        <w:rPr>
+          <w:rFonts w:cstheme="minorHAnsi"/>
+          <w:sz w:val="28"/>
+          <w:szCs w:val="28"/>
+        </w:rPr>
+        <w:t xml:space="preserve"> by 1 degree or more</w:t>
+      </w:r>
+    </w:p>
+    <w:p>
+      <w:pPr>
+        <w:pStyle w:val="ListParagraph"/>
+        <w:numPr>
+          <w:ilvl w:val="2"/>
+          <w:numId w:val="2"/>
+        </w:numPr>
+        <w:spacing w:line="240" w:lineRule="auto"/>
+        <w:jc w:val="both"/>
+        <w:rPr>
+          <w:rFonts w:cstheme="minorHAnsi"/>
+          <w:sz w:val="28"/>
+          <w:szCs w:val="28"/>
+        </w:rPr>
+      </w:pPr>
+      <w:r>
+        <w:rPr>
+          <w:rFonts w:cstheme="minorHAnsi"/>
+          <w:sz w:val="28"/>
+          <w:szCs w:val="28"/>
+        </w:rPr>
+        <w:t xml:space="preserve">STOP </w:t>
+      </w:r>
+      <w:r>
+        <w:rPr>
+          <w:rFonts w:cstheme="minorHAnsi"/>
+          <w:sz w:val="28"/>
+          <w:szCs w:val="28"/>
+        </w:rPr>
+        <w:t>HEATING</w:t>
+      </w:r>
+    </w:p>
+    <w:p>
+      <w:pPr>
+        <w:pStyle w:val="ListParagraph"/>
+        <w:numPr>
+          <w:ilvl w:val="3"/>
+          <w:numId w:val="2"/>
+        </w:numPr>
+        <w:spacing w:line="240" w:lineRule="auto"/>
+        <w:jc w:val="both"/>
+        <w:rPr>
+          <w:rFonts w:cstheme="minorHAnsi"/>
+          <w:sz w:val="28"/>
+          <w:szCs w:val="28"/>
+        </w:rPr>
+      </w:pPr>
+      <w:r>
+        <w:rPr>
+          <w:rFonts w:cstheme="minorHAnsi"/>
+          <w:color w:val="FF0000"/>
+          <w:sz w:val="28"/>
+          <w:szCs w:val="28"/>
+        </w:rPr>
+        <w:t>No Thermometer</w:t>
+      </w:r>
+      <w:r>
+        <w:rPr>
+          <w:rFonts w:cstheme="minorHAnsi"/>
+          <w:sz w:val="28"/>
+          <w:szCs w:val="28"/>
+        </w:rPr>
+        <w:t xml:space="preserve"> ico</w:t>
+      </w:r>
+      <w:r>
+        <w:rPr>
+          <w:rFonts w:cstheme="minorHAnsi"/>
+          <w:sz w:val="28"/>
+          <w:szCs w:val="28"/>
+        </w:rPr>
+        <w:t>n</w:t>
+      </w:r>
+      <w:r>
+        <w:rPr>
+          <w:rFonts w:cstheme="minorHAnsi"/>
+          <w:sz w:val="28"/>
+          <w:szCs w:val="28"/>
+        </w:rPr>
+        <w:t>.</w:t>
+      </w:r>
+    </w:p>
+    <w:p>
+      <w:pPr>
+        <w:spacing w:line="240" w:lineRule="auto"/>
+        <w:ind w:left="720"/>
+        <w:jc w:val="both"/>
+        <w:rPr>
+          <w:rFonts w:cstheme="minorHAnsi"/>
           <w:sz w:val="28"/>
           <w:szCs w:val="28"/>
         </w:rPr>
@@ -1063,7 +2292,23 @@
           <w:szCs w:val="28"/>
         </w:rPr>
         <w:lastRenderedPageBreak/>
-        <w:t xml:space="preserve"> 10 to 37 degrees.</w:t>
+        <w:t>(</w:t>
+      </w:r>
+      <w:r>
+        <w:rPr>
+          <w:rFonts w:cstheme="minorHAnsi"/>
+          <w:sz w:val="28"/>
+          <w:szCs w:val="28"/>
+        </w:rPr>
+        <w:t>“CIRCULATION PUMP” starts occasionally. Cannot be operated manually while in a Normal Working</w:t>
+      </w:r>
+      <w:r>
+        <w:rPr>
+          <w:rFonts w:cstheme="minorHAnsi"/>
+          <w:sz w:val="28"/>
+          <w:szCs w:val="28"/>
+        </w:rPr>
+        <w:t>).</w:t>
       </w:r>
     </w:p>
     <w:p>
@@ -1077,25 +2322,42 @@
         <w:jc w:val="both"/>
         <w:rPr>
           <w:rFonts w:cstheme="minorHAnsi"/>
-          <w:sz w:val="28"/>
-          <w:szCs w:val="28"/>
-        </w:rPr>
-      </w:pPr>
-      <w:r>
-        <w:rPr>
-          <w:rFonts w:cstheme="minorHAnsi"/>
-          <w:sz w:val="28"/>
-          <w:szCs w:val="28"/>
-        </w:rPr>
-        <w:t xml:space="preserve">Temp Range </w:t>
-      </w:r>
-      <w:r>
-        <w:rPr>
-          <w:rFonts w:cstheme="minorHAnsi"/>
-          <w:sz w:val="28"/>
-          <w:szCs w:val="28"/>
-        </w:rPr>
-        <w:t>HIGH.</w:t>
+          <w:b/>
+          <w:sz w:val="28"/>
+          <w:szCs w:val="28"/>
+        </w:rPr>
+      </w:pPr>
+      <w:r>
+        <w:rPr>
+          <w:rFonts w:cstheme="minorHAnsi"/>
+          <w:sz w:val="28"/>
+          <w:szCs w:val="28"/>
+        </w:rPr>
+        <w:t xml:space="preserve"> </w:t>
+      </w:r>
+      <w:r>
+        <w:rPr>
+          <w:rFonts w:cstheme="minorHAnsi"/>
+          <w:sz w:val="28"/>
+          <w:szCs w:val="28"/>
+        </w:rPr>
+        <w:t>“</w:t>
+      </w:r>
+      <w:r>
+        <w:rPr>
+          <w:rFonts w:cstheme="minorHAnsi"/>
+          <w:sz w:val="28"/>
+          <w:szCs w:val="28"/>
+        </w:rPr>
+        <w:t>REST</w:t>
+      </w:r>
+      <w:r>
+        <w:rPr>
+          <w:rFonts w:cstheme="minorHAnsi"/>
+          <w:sz w:val="28"/>
+          <w:szCs w:val="28"/>
+        </w:rPr>
+        <w:t>”</w:t>
       </w:r>
     </w:p>
     <w:p>
@@ -1109,47 +2371,67 @@
         <w:jc w:val="both"/>
         <w:rPr>
           <w:rFonts w:cstheme="minorHAnsi"/>
-          <w:sz w:val="28"/>
-          <w:szCs w:val="28"/>
-        </w:rPr>
-      </w:pPr>
-      <w:r>
-        <w:rPr>
-          <w:rFonts w:cstheme="minorHAnsi"/>
-          <w:sz w:val="28"/>
-          <w:szCs w:val="28"/>
-        </w:rPr>
-        <w:t>26.5 to 40 degrees.</w:t>
-      </w:r>
-    </w:p>
-    <w:p>
-      <w:pPr>
-        <w:spacing w:line="240" w:lineRule="auto"/>
-        <w:jc w:val="both"/>
-        <w:rPr>
-          <w:rFonts w:cstheme="minorHAnsi"/>
-          <w:b/>
-          <w:sz w:val="28"/>
-          <w:szCs w:val="28"/>
-        </w:rPr>
-      </w:pPr>
-      <w:r>
-        <w:rPr>
-          <w:rFonts w:cstheme="minorHAnsi"/>
-          <w:b/>
-          <w:sz w:val="28"/>
-          <w:szCs w:val="28"/>
-        </w:rPr>
-        <w:t>Heat Mode:</w:t>
-      </w:r>
-      <w:r>
-        <w:rPr>
-          <w:rFonts w:cstheme="minorHAnsi"/>
-          <w:b/>
-          <w:sz w:val="28"/>
-          <w:szCs w:val="28"/>
-        </w:rPr>
-        <w:tab/>
+          <w:b/>
+          <w:sz w:val="28"/>
+          <w:szCs w:val="28"/>
+        </w:rPr>
+      </w:pPr>
+      <w:r>
+        <w:rPr>
+          <w:rFonts w:cstheme="minorHAnsi"/>
+          <w:sz w:val="28"/>
+          <w:szCs w:val="28"/>
+        </w:rPr>
+        <w:t>By switching into it, Heating stops immediately</w:t>
+      </w:r>
+      <w:r>
+        <w:rPr>
+          <w:rFonts w:cstheme="minorHAnsi"/>
+          <w:sz w:val="28"/>
+          <w:szCs w:val="28"/>
+        </w:rPr>
+        <w:t xml:space="preserve"> </w:t>
+      </w:r>
+    </w:p>
+    <w:p>
+      <w:pPr>
+        <w:pStyle w:val="ListParagraph"/>
+        <w:numPr>
+          <w:ilvl w:val="1"/>
+          <w:numId w:val="2"/>
+        </w:numPr>
+        <w:spacing w:line="240" w:lineRule="auto"/>
+        <w:jc w:val="both"/>
+        <w:rPr>
+          <w:rFonts w:cstheme="minorHAnsi"/>
+          <w:b/>
+          <w:sz w:val="28"/>
+          <w:szCs w:val="28"/>
+        </w:rPr>
+      </w:pPr>
+      <w:r>
+        <w:rPr>
+          <w:rFonts w:cstheme="minorHAnsi"/>
+          <w:sz w:val="28"/>
+          <w:szCs w:val="28"/>
+        </w:rPr>
+        <w:t xml:space="preserve">Jet1, Jet2, &amp; Blower (if were running) </w:t>
+      </w:r>
+      <w:r>
+        <w:rPr>
+          <w:rFonts w:cstheme="minorHAnsi"/>
+          <w:sz w:val="28"/>
+          <w:szCs w:val="28"/>
+        </w:rPr>
+        <w:t>stop</w:t>
+      </w:r>
+      <w:r>
+        <w:rPr>
+          <w:rFonts w:cstheme="minorHAnsi"/>
+          <w:sz w:val="28"/>
+          <w:szCs w:val="28"/>
+        </w:rPr>
+        <w:t xml:space="preserve"> after some time</w:t>
       </w:r>
     </w:p>
     <w:p>
@@ -1163,26 +2445,41 @@
         <w:jc w:val="both"/>
         <w:rPr>
           <w:rFonts w:cstheme="minorHAnsi"/>
-          <w:b/>
-          <w:sz w:val="28"/>
-          <w:szCs w:val="28"/>
-        </w:rPr>
-      </w:pPr>
-      <w:r>
-        <w:rPr>
-          <w:rFonts w:cstheme="minorHAnsi"/>
-          <w:sz w:val="28"/>
-          <w:szCs w:val="28"/>
-        </w:rPr>
-        <w:t xml:space="preserve"> “</w:t>
-      </w:r>
-      <w:r>
-        <w:rPr>
-          <w:rFonts w:cstheme="minorHAnsi"/>
-          <w:sz w:val="28"/>
-          <w:szCs w:val="28"/>
-        </w:rPr>
-        <w:t>READY</w:t>
+          <w:sz w:val="28"/>
+          <w:szCs w:val="28"/>
+        </w:rPr>
+      </w:pPr>
+      <w:r>
+        <w:rPr>
+          <w:rFonts w:cstheme="minorHAnsi"/>
+          <w:sz w:val="28"/>
+          <w:szCs w:val="28"/>
+        </w:rPr>
+        <w:t>“</w:t>
+      </w:r>
+      <w:r>
+        <w:rPr>
+          <w:rFonts w:cstheme="minorHAnsi"/>
+          <w:sz w:val="28"/>
+          <w:szCs w:val="28"/>
+        </w:rPr>
+        <w:t>READY/REST</w:t>
+      </w:r>
+      <w:r>
+        <w:rPr>
+          <w:rFonts w:cstheme="minorHAnsi"/>
+          <w:sz w:val="28"/>
+          <w:szCs w:val="28"/>
+        </w:rPr>
+        <w:t xml:space="preserve"> or </w:t>
+      </w:r>
+      <w:r>
+        <w:rPr>
+          <w:rFonts w:cstheme="minorHAnsi"/>
+          <w:sz w:val="28"/>
+          <w:szCs w:val="28"/>
+        </w:rPr>
+        <w:t>READY-IN-REST</w:t>
       </w:r>
       <w:r>
         <w:rPr>
@@ -1215,48 +2512,7 @@
           <w:sz w:val="28"/>
           <w:szCs w:val="28"/>
         </w:rPr>
-        <w:t>Works as describe below in the Heating States.</w:t>
-      </w:r>
-    </w:p>
-    <w:p>
-      <w:pPr>
-        <w:pStyle w:val="ListParagraph"/>
-        <w:numPr>
-          <w:ilvl w:val="0"/>
-          <w:numId w:val="2"/>
-        </w:numPr>
-        <w:spacing w:line="240" w:lineRule="auto"/>
-        <w:jc w:val="both"/>
-        <w:rPr>
-          <w:rFonts w:cstheme="minorHAnsi"/>
-          <w:b/>
-          <w:sz w:val="28"/>
-          <w:szCs w:val="28"/>
-        </w:rPr>
-      </w:pPr>
-      <w:r>
-        <w:rPr>
-          <w:rFonts w:cstheme="minorHAnsi"/>
-          <w:sz w:val="28"/>
-          <w:szCs w:val="28"/>
-        </w:rPr>
-        <w:t>“</w:t>
-      </w:r>
-      <w:r>
-        <w:rPr>
-          <w:rFonts w:cstheme="minorHAnsi"/>
-          <w:sz w:val="28"/>
-          <w:szCs w:val="28"/>
-        </w:rPr>
-        <w:t>REST</w:t>
-      </w:r>
-      <w:r>
-        <w:rPr>
-          <w:rFonts w:cstheme="minorHAnsi"/>
-          <w:sz w:val="28"/>
-          <w:szCs w:val="28"/>
-        </w:rPr>
-        <w:t>”</w:t>
+        <w:t>Operating Jet1 in the Rest Mode, switches the mode to the Ready/Rest Mode.</w:t>
       </w:r>
     </w:p>
     <w:p>
@@ -1270,18 +2526,49 @@
         <w:jc w:val="both"/>
         <w:rPr>
           <w:rFonts w:cstheme="minorHAnsi"/>
-          <w:b/>
-          <w:sz w:val="28"/>
-          <w:szCs w:val="28"/>
-        </w:rPr>
-      </w:pPr>
-      <w:r>
-        <w:rPr>
-          <w:rFonts w:cstheme="minorHAnsi"/>
-          <w:sz w:val="28"/>
-          <w:szCs w:val="28"/>
-        </w:rPr>
-        <w:t>By switching into it, Heating stops immediately.</w:t>
+          <w:sz w:val="28"/>
+          <w:szCs w:val="28"/>
+        </w:rPr>
+      </w:pPr>
+      <w:r>
+        <w:rPr>
+          <w:rFonts w:cstheme="minorHAnsi"/>
+          <w:sz w:val="28"/>
+          <w:szCs w:val="28"/>
+        </w:rPr>
+        <w:t>Spa-Controller</w:t>
+      </w:r>
+      <w:r>
+        <w:rPr>
+          <w:rFonts w:cstheme="minorHAnsi"/>
+          <w:sz w:val="28"/>
+          <w:szCs w:val="28"/>
+        </w:rPr>
+        <w:t xml:space="preserve"> works </w:t>
+      </w:r>
+      <w:r>
+        <w:rPr>
+          <w:rFonts w:cstheme="minorHAnsi"/>
+          <w:sz w:val="28"/>
+          <w:szCs w:val="28"/>
+        </w:rPr>
+        <w:t xml:space="preserve">normally as </w:t>
+      </w:r>
+      <w:r>
+        <w:rPr>
+          <w:rFonts w:cstheme="minorHAnsi"/>
+          <w:sz w:val="28"/>
+          <w:szCs w:val="28"/>
+        </w:rPr>
+        <w:t>in Ready Mode</w:t>
+      </w:r>
+      <w:r>
+        <w:rPr>
+          <w:rFonts w:cstheme="minorHAnsi"/>
+          <w:sz w:val="28"/>
+          <w:szCs w:val="28"/>
+        </w:rPr>
+        <w:t>.</w:t>
       </w:r>
     </w:p>
     <w:p>
@@ -1306,192 +2593,6 @@
           <w:sz w:val="28"/>
           <w:szCs w:val="28"/>
         </w:rPr>
-        <w:t xml:space="preserve">Other devices </w:t>
-      </w:r>
-      <w:r>
-        <w:rPr>
-          <w:rFonts w:cstheme="minorHAnsi"/>
-          <w:sz w:val="28"/>
-          <w:szCs w:val="28"/>
-        </w:rPr>
-        <w:t>stop</w:t>
-      </w:r>
-      <w:r>
-        <w:rPr>
-          <w:rFonts w:cstheme="minorHAnsi"/>
-          <w:sz w:val="28"/>
-          <w:szCs w:val="28"/>
-        </w:rPr>
-        <w:t xml:space="preserve"> after some time.</w:t>
-      </w:r>
-    </w:p>
-    <w:p>
-      <w:pPr>
-        <w:pStyle w:val="ListParagraph"/>
-        <w:numPr>
-          <w:ilvl w:val="1"/>
-          <w:numId w:val="2"/>
-        </w:numPr>
-        <w:spacing w:line="240" w:lineRule="auto"/>
-        <w:jc w:val="both"/>
-        <w:rPr>
-          <w:rFonts w:cstheme="minorHAnsi"/>
-          <w:b/>
-          <w:sz w:val="28"/>
-          <w:szCs w:val="28"/>
-        </w:rPr>
-      </w:pPr>
-      <w:r>
-        <w:rPr>
-          <w:rFonts w:cstheme="minorHAnsi"/>
-          <w:sz w:val="28"/>
-          <w:szCs w:val="28"/>
-        </w:rPr>
-        <w:t xml:space="preserve">Operating </w:t>
-      </w:r>
-      <w:r>
-        <w:rPr>
-          <w:rFonts w:cstheme="minorHAnsi"/>
-          <w:sz w:val="28"/>
-          <w:szCs w:val="28"/>
-        </w:rPr>
-        <w:t>Jet1 in this mode, switches the mode to the Ready/Rest Mode.</w:t>
-      </w:r>
-    </w:p>
-    <w:p>
-      <w:pPr>
-        <w:pStyle w:val="ListParagraph"/>
-        <w:numPr>
-          <w:ilvl w:val="0"/>
-          <w:numId w:val="2"/>
-        </w:numPr>
-        <w:spacing w:line="240" w:lineRule="auto"/>
-        <w:jc w:val="both"/>
-        <w:rPr>
-          <w:rFonts w:cstheme="minorHAnsi"/>
-          <w:sz w:val="28"/>
-          <w:szCs w:val="28"/>
-        </w:rPr>
-      </w:pPr>
-      <w:r>
-        <w:rPr>
-          <w:rFonts w:cstheme="minorHAnsi"/>
-          <w:sz w:val="28"/>
-          <w:szCs w:val="28"/>
-        </w:rPr>
-        <w:t>“</w:t>
-      </w:r>
-      <w:r>
-        <w:rPr>
-          <w:rFonts w:cstheme="minorHAnsi"/>
-          <w:sz w:val="28"/>
-          <w:szCs w:val="28"/>
-        </w:rPr>
-        <w:t>READY/REST</w:t>
-      </w:r>
-      <w:r>
-        <w:rPr>
-          <w:rFonts w:cstheme="minorHAnsi"/>
-          <w:sz w:val="28"/>
-          <w:szCs w:val="28"/>
-        </w:rPr>
-        <w:t xml:space="preserve"> or </w:t>
-      </w:r>
-      <w:r>
-        <w:rPr>
-          <w:rFonts w:cstheme="minorHAnsi"/>
-          <w:sz w:val="28"/>
-          <w:szCs w:val="28"/>
-        </w:rPr>
-        <w:t>READY-IN-REST</w:t>
-      </w:r>
-      <w:r>
-        <w:rPr>
-          <w:rFonts w:cstheme="minorHAnsi"/>
-          <w:sz w:val="28"/>
-          <w:szCs w:val="28"/>
-        </w:rPr>
-        <w:t>”</w:t>
-      </w:r>
-    </w:p>
-    <w:p>
-      <w:pPr>
-        <w:pStyle w:val="ListParagraph"/>
-        <w:numPr>
-          <w:ilvl w:val="1"/>
-          <w:numId w:val="2"/>
-        </w:numPr>
-        <w:spacing w:line="240" w:lineRule="auto"/>
-        <w:jc w:val="both"/>
-        <w:rPr>
-          <w:rFonts w:cstheme="minorHAnsi"/>
-          <w:sz w:val="28"/>
-          <w:szCs w:val="28"/>
-        </w:rPr>
-      </w:pPr>
-      <w:r>
-        <w:rPr>
-          <w:rFonts w:cstheme="minorHAnsi"/>
-          <w:sz w:val="28"/>
-          <w:szCs w:val="28"/>
-        </w:rPr>
-        <w:t>Spa-Controller</w:t>
-      </w:r>
-      <w:r>
-        <w:rPr>
-          <w:rFonts w:cstheme="minorHAnsi"/>
-          <w:sz w:val="28"/>
-          <w:szCs w:val="28"/>
-        </w:rPr>
-        <w:t xml:space="preserve"> works </w:t>
-      </w:r>
-      <w:r>
-        <w:rPr>
-          <w:rFonts w:cstheme="minorHAnsi"/>
-          <w:sz w:val="28"/>
-          <w:szCs w:val="28"/>
-        </w:rPr>
-        <w:t xml:space="preserve">normally as </w:t>
-      </w:r>
-      <w:r>
-        <w:rPr>
-          <w:rFonts w:cstheme="minorHAnsi"/>
-          <w:sz w:val="28"/>
-          <w:szCs w:val="28"/>
-        </w:rPr>
-        <w:t>in Ready Mode</w:t>
-      </w:r>
-      <w:r>
-        <w:rPr>
-          <w:rFonts w:cstheme="minorHAnsi"/>
-          <w:sz w:val="28"/>
-          <w:szCs w:val="28"/>
-        </w:rPr>
-        <w:t>.</w:t>
-      </w:r>
-    </w:p>
-    <w:p>
-      <w:pPr>
-        <w:pStyle w:val="ListParagraph"/>
-        <w:numPr>
-          <w:ilvl w:val="1"/>
-          <w:numId w:val="2"/>
-        </w:numPr>
-        <w:spacing w:line="240" w:lineRule="auto"/>
-        <w:jc w:val="both"/>
-        <w:rPr>
-          <w:rFonts w:cstheme="minorHAnsi"/>
-          <w:b/>
-          <w:sz w:val="28"/>
-          <w:szCs w:val="28"/>
-        </w:rPr>
-      </w:pPr>
-      <w:r>
-        <w:rPr>
-          <w:rFonts w:cstheme="minorHAnsi"/>
-          <w:sz w:val="28"/>
-          <w:szCs w:val="28"/>
-        </w:rPr>
         <w:t>Does not switch back to the Rest Mode automatically.</w:t>
       </w:r>
     </w:p>
@@ -1501,7 +2602,6 @@
         <w:jc w:val="both"/>
         <w:rPr>
           <w:rFonts w:cstheme="minorHAnsi"/>
-          <w:b/>
           <w:sz w:val="28"/>
           <w:szCs w:val="28"/>
         </w:rPr>
@@ -1514,579 +2614,6 @@
           <w:szCs w:val="28"/>
         </w:rPr>
         <w:t xml:space="preserve"> </w:t>
-      </w:r>
-      <w:r>
-        <w:rPr>
-          <w:rFonts w:cstheme="minorHAnsi"/>
-          <w:b/>
-          <w:sz w:val="28"/>
-          <w:szCs w:val="28"/>
-        </w:rPr>
-        <w:t xml:space="preserve">Heating </w:t>
-      </w:r>
-      <w:r>
-        <w:rPr>
-          <w:rFonts w:cstheme="minorHAnsi"/>
-          <w:b/>
-          <w:sz w:val="28"/>
-          <w:szCs w:val="28"/>
-        </w:rPr>
-        <w:t>State</w:t>
-      </w:r>
-      <w:r>
-        <w:rPr>
-          <w:rFonts w:cstheme="minorHAnsi"/>
-          <w:b/>
-          <w:sz w:val="28"/>
-          <w:szCs w:val="28"/>
-        </w:rPr>
-        <w:t>:</w:t>
-      </w:r>
-    </w:p>
-    <w:p>
-      <w:pPr>
-        <w:pStyle w:val="ListParagraph"/>
-        <w:numPr>
-          <w:ilvl w:val="0"/>
-          <w:numId w:val="5"/>
-        </w:numPr>
-        <w:spacing w:line="240" w:lineRule="auto"/>
-        <w:jc w:val="both"/>
-        <w:rPr>
-          <w:rFonts w:cstheme="minorHAnsi"/>
-          <w:sz w:val="28"/>
-          <w:szCs w:val="28"/>
-        </w:rPr>
-      </w:pPr>
-      <w:r>
-        <w:rPr>
-          <w:rFonts w:cstheme="minorHAnsi"/>
-          <w:sz w:val="28"/>
-          <w:szCs w:val="28"/>
-        </w:rPr>
-        <w:t xml:space="preserve">If Measured Temp </w:t>
-      </w:r>
-      <w:r>
-        <w:rPr>
-          <w:rFonts w:cstheme="minorHAnsi"/>
-          <w:sz w:val="28"/>
-          <w:szCs w:val="28"/>
-        </w:rPr>
-        <w:t xml:space="preserve">&lt; </w:t>
-      </w:r>
-      <w:r>
-        <w:rPr>
-          <w:rFonts w:cstheme="minorHAnsi"/>
-          <w:sz w:val="28"/>
-          <w:szCs w:val="28"/>
-        </w:rPr>
-        <w:t>Set Temp by 1 Degree or more</w:t>
-      </w:r>
-      <w:r>
-        <w:rPr>
-          <w:rFonts w:cstheme="minorHAnsi"/>
-          <w:sz w:val="28"/>
-          <w:szCs w:val="28"/>
-        </w:rPr>
-        <w:t>.</w:t>
-      </w:r>
-      <w:r>
-        <w:rPr>
-          <w:rFonts w:cstheme="minorHAnsi"/>
-          <w:sz w:val="28"/>
-          <w:szCs w:val="28"/>
-        </w:rPr>
-        <w:t xml:space="preserve"> </w:t>
-      </w:r>
-    </w:p>
-    <w:p>
-      <w:pPr>
-        <w:pStyle w:val="ListParagraph"/>
-        <w:numPr>
-          <w:ilvl w:val="1"/>
-          <w:numId w:val="5"/>
-        </w:numPr>
-        <w:spacing w:line="240" w:lineRule="auto"/>
-        <w:jc w:val="both"/>
-        <w:rPr>
-          <w:rFonts w:cstheme="minorHAnsi"/>
-          <w:sz w:val="28"/>
-          <w:szCs w:val="28"/>
-        </w:rPr>
-      </w:pPr>
-      <w:r>
-        <w:rPr>
-          <w:rFonts w:cstheme="minorHAnsi"/>
-          <w:sz w:val="28"/>
-          <w:szCs w:val="28"/>
-        </w:rPr>
-        <w:t>“</w:t>
-      </w:r>
-      <w:r>
-        <w:rPr>
-          <w:rFonts w:cstheme="minorHAnsi"/>
-          <w:sz w:val="28"/>
-          <w:szCs w:val="28"/>
-        </w:rPr>
-        <w:t>HEATING</w:t>
-      </w:r>
-      <w:r>
-        <w:rPr>
-          <w:rFonts w:cstheme="minorHAnsi"/>
-          <w:sz w:val="28"/>
-          <w:szCs w:val="28"/>
-        </w:rPr>
-        <w:t>”</w:t>
-      </w:r>
-      <w:r>
-        <w:rPr>
-          <w:rFonts w:cstheme="minorHAnsi"/>
-          <w:sz w:val="28"/>
-          <w:szCs w:val="28"/>
-        </w:rPr>
-        <w:t xml:space="preserve"> </w:t>
-      </w:r>
-      <w:r>
-        <w:rPr>
-          <w:rFonts w:cstheme="minorHAnsi"/>
-          <w:sz w:val="28"/>
-          <w:szCs w:val="28"/>
-        </w:rPr>
-        <w:t>S</w:t>
-      </w:r>
-      <w:r>
-        <w:rPr>
-          <w:rFonts w:cstheme="minorHAnsi"/>
-          <w:sz w:val="28"/>
-          <w:szCs w:val="28"/>
-        </w:rPr>
-        <w:t>tate</w:t>
-      </w:r>
-      <w:r>
-        <w:rPr>
-          <w:rFonts w:cstheme="minorHAnsi"/>
-          <w:sz w:val="28"/>
-          <w:szCs w:val="28"/>
-        </w:rPr>
-        <w:t>.</w:t>
-      </w:r>
-    </w:p>
-    <w:p>
-      <w:pPr>
-        <w:pStyle w:val="ListParagraph"/>
-        <w:numPr>
-          <w:ilvl w:val="2"/>
-          <w:numId w:val="5"/>
-        </w:numPr>
-        <w:spacing w:line="240" w:lineRule="auto"/>
-        <w:jc w:val="both"/>
-        <w:rPr>
-          <w:rFonts w:cstheme="minorHAnsi"/>
-          <w:sz w:val="28"/>
-          <w:szCs w:val="28"/>
-        </w:rPr>
-      </w:pPr>
-      <w:r>
-        <w:rPr>
-          <w:rFonts w:cstheme="minorHAnsi"/>
-          <w:sz w:val="28"/>
-          <w:szCs w:val="28"/>
-        </w:rPr>
-        <w:t xml:space="preserve">Red </w:t>
-      </w:r>
-      <w:r>
-        <w:rPr>
-          <w:rFonts w:cstheme="minorHAnsi"/>
-          <w:sz w:val="28"/>
-          <w:szCs w:val="28"/>
-        </w:rPr>
-        <w:t>“</w:t>
-      </w:r>
-      <w:r>
-        <w:rPr>
-          <w:rFonts w:cstheme="minorHAnsi"/>
-          <w:sz w:val="28"/>
-          <w:szCs w:val="28"/>
-        </w:rPr>
-        <w:t xml:space="preserve">Thermometer </w:t>
-      </w:r>
-      <w:r>
-        <w:rPr>
-          <w:rFonts w:cstheme="minorHAnsi"/>
-          <w:sz w:val="28"/>
-          <w:szCs w:val="28"/>
-        </w:rPr>
-        <w:t>w</w:t>
-      </w:r>
-      <w:r>
-        <w:rPr>
-          <w:rFonts w:cstheme="minorHAnsi"/>
-          <w:sz w:val="28"/>
-          <w:szCs w:val="28"/>
-        </w:rPr>
-        <w:t>ith Increasing Temperature</w:t>
-      </w:r>
-      <w:r>
-        <w:rPr>
-          <w:rFonts w:cstheme="minorHAnsi"/>
-          <w:sz w:val="28"/>
-          <w:szCs w:val="28"/>
-        </w:rPr>
-        <w:t>” icon</w:t>
-      </w:r>
-      <w:r>
-        <w:rPr>
-          <w:rFonts w:cstheme="minorHAnsi"/>
-          <w:sz w:val="28"/>
-          <w:szCs w:val="28"/>
-        </w:rPr>
-        <w:t xml:space="preserve"> popup</w:t>
-      </w:r>
-      <w:r>
-        <w:rPr>
-          <w:rFonts w:cstheme="minorHAnsi"/>
-          <w:sz w:val="28"/>
-          <w:szCs w:val="28"/>
-        </w:rPr>
-        <w:t>.</w:t>
-      </w:r>
-    </w:p>
-    <w:p>
-      <w:pPr>
-        <w:pStyle w:val="ListParagraph"/>
-        <w:numPr>
-          <w:ilvl w:val="1"/>
-          <w:numId w:val="5"/>
-        </w:numPr>
-        <w:spacing w:line="240" w:lineRule="auto"/>
-        <w:jc w:val="both"/>
-        <w:rPr>
-          <w:rFonts w:cstheme="minorHAnsi"/>
-          <w:sz w:val="28"/>
-          <w:szCs w:val="28"/>
-        </w:rPr>
-      </w:pPr>
-      <w:r>
-        <w:rPr>
-          <w:rFonts w:cstheme="minorHAnsi"/>
-          <w:sz w:val="28"/>
-          <w:szCs w:val="28"/>
-        </w:rPr>
-        <w:t>HEAT WAITING</w:t>
-      </w:r>
-      <w:r>
-        <w:rPr>
-          <w:rFonts w:cstheme="minorHAnsi"/>
-          <w:sz w:val="28"/>
-          <w:szCs w:val="28"/>
-        </w:rPr>
-        <w:t xml:space="preserve">” state </w:t>
-      </w:r>
-      <w:r>
-        <w:rPr>
-          <w:rFonts w:cstheme="minorHAnsi"/>
-          <w:sz w:val="28"/>
-          <w:szCs w:val="28"/>
-        </w:rPr>
-        <w:t>for 1 to 2 Min.</w:t>
-      </w:r>
-    </w:p>
-    <w:p>
-      <w:pPr>
-        <w:pStyle w:val="ListParagraph"/>
-        <w:numPr>
-          <w:ilvl w:val="2"/>
-          <w:numId w:val="5"/>
-        </w:numPr>
-        <w:spacing w:line="240" w:lineRule="auto"/>
-        <w:jc w:val="both"/>
-        <w:rPr>
-          <w:rFonts w:cstheme="minorHAnsi"/>
-          <w:sz w:val="28"/>
-          <w:szCs w:val="28"/>
-        </w:rPr>
-      </w:pPr>
-      <w:r>
-        <w:rPr>
-          <w:rFonts w:cstheme="minorHAnsi"/>
-          <w:sz w:val="28"/>
-          <w:szCs w:val="28"/>
-        </w:rPr>
-        <w:t>Red “Blinking Thermometer” icon.</w:t>
-      </w:r>
-    </w:p>
-    <w:p>
-      <w:pPr>
-        <w:pStyle w:val="ListParagraph"/>
-        <w:numPr>
-          <w:ilvl w:val="1"/>
-          <w:numId w:val="5"/>
-        </w:numPr>
-        <w:spacing w:line="240" w:lineRule="auto"/>
-        <w:jc w:val="both"/>
-        <w:rPr>
-          <w:rFonts w:cstheme="minorHAnsi"/>
-          <w:sz w:val="28"/>
-          <w:szCs w:val="28"/>
-        </w:rPr>
-      </w:pPr>
-      <w:r>
-        <w:rPr>
-          <w:rFonts w:cstheme="minorHAnsi"/>
-          <w:sz w:val="28"/>
-          <w:szCs w:val="28"/>
-        </w:rPr>
-        <w:t>Heating State again.</w:t>
-      </w:r>
-    </w:p>
-    <w:p>
-      <w:pPr>
-        <w:pStyle w:val="ListParagraph"/>
-        <w:numPr>
-          <w:ilvl w:val="0"/>
-          <w:numId w:val="2"/>
-        </w:numPr>
-        <w:spacing w:line="240" w:lineRule="auto"/>
-        <w:jc w:val="both"/>
-        <w:rPr>
-          <w:rFonts w:cstheme="minorHAnsi"/>
-          <w:sz w:val="28"/>
-          <w:szCs w:val="28"/>
-        </w:rPr>
-      </w:pPr>
-      <w:r>
-        <w:rPr>
-          <w:rFonts w:cstheme="minorHAnsi"/>
-          <w:sz w:val="28"/>
-          <w:szCs w:val="28"/>
-        </w:rPr>
-        <w:t xml:space="preserve">If </w:t>
-      </w:r>
-      <w:r>
-        <w:rPr>
-          <w:rFonts w:cstheme="minorHAnsi"/>
-          <w:sz w:val="28"/>
-          <w:szCs w:val="28"/>
-        </w:rPr>
-        <w:t xml:space="preserve">Measured Temperature </w:t>
-      </w:r>
-      <w:r>
-        <w:rPr>
-          <w:rFonts w:cstheme="minorHAnsi"/>
-          <w:sz w:val="28"/>
-          <w:szCs w:val="28"/>
-        </w:rPr>
-        <w:t xml:space="preserve">&gt; </w:t>
-      </w:r>
-      <w:r>
-        <w:rPr>
-          <w:rFonts w:cstheme="minorHAnsi"/>
-          <w:sz w:val="28"/>
-          <w:szCs w:val="28"/>
-        </w:rPr>
-        <w:t>Set Temperature</w:t>
-      </w:r>
-      <w:r>
-        <w:rPr>
-          <w:rFonts w:cstheme="minorHAnsi"/>
-          <w:sz w:val="28"/>
-          <w:szCs w:val="28"/>
-        </w:rPr>
-        <w:t xml:space="preserve"> by 1 degree or more.</w:t>
-      </w:r>
-    </w:p>
-    <w:p>
-      <w:pPr>
-        <w:pStyle w:val="ListParagraph"/>
-        <w:numPr>
-          <w:ilvl w:val="1"/>
-          <w:numId w:val="2"/>
-        </w:numPr>
-        <w:spacing w:line="240" w:lineRule="auto"/>
-        <w:jc w:val="both"/>
-        <w:rPr>
-          <w:rFonts w:cstheme="minorHAnsi"/>
-          <w:sz w:val="28"/>
-          <w:szCs w:val="28"/>
-        </w:rPr>
-      </w:pPr>
-      <w:r>
-        <w:rPr>
-          <w:rFonts w:cstheme="minorHAnsi"/>
-          <w:sz w:val="28"/>
-          <w:szCs w:val="28"/>
-        </w:rPr>
-        <w:t>STOP HEATING</w:t>
-      </w:r>
-      <w:r>
-        <w:rPr>
-          <w:rFonts w:cstheme="minorHAnsi"/>
-          <w:sz w:val="28"/>
-          <w:szCs w:val="28"/>
-        </w:rPr>
-        <w:t>.</w:t>
-      </w:r>
-    </w:p>
-    <w:p>
-      <w:pPr>
-        <w:pStyle w:val="ListParagraph"/>
-        <w:numPr>
-          <w:ilvl w:val="2"/>
-          <w:numId w:val="2"/>
-        </w:numPr>
-        <w:spacing w:line="240" w:lineRule="auto"/>
-        <w:jc w:val="both"/>
-        <w:rPr>
-          <w:rFonts w:cstheme="minorHAnsi"/>
-          <w:sz w:val="28"/>
-          <w:szCs w:val="28"/>
-        </w:rPr>
-      </w:pPr>
-      <w:r>
-        <w:rPr>
-          <w:rFonts w:cstheme="minorHAnsi"/>
-          <w:sz w:val="28"/>
-          <w:szCs w:val="28"/>
-        </w:rPr>
-        <w:t xml:space="preserve">No </w:t>
-      </w:r>
-      <w:r>
-        <w:rPr>
-          <w:rFonts w:cstheme="minorHAnsi"/>
-          <w:sz w:val="28"/>
-          <w:szCs w:val="28"/>
-        </w:rPr>
-        <w:t>Thermometer ico</w:t>
-      </w:r>
-      <w:r>
-        <w:rPr>
-          <w:rFonts w:cstheme="minorHAnsi"/>
-          <w:sz w:val="28"/>
-          <w:szCs w:val="28"/>
-        </w:rPr>
-        <w:t>n</w:t>
-      </w:r>
-      <w:r>
-        <w:rPr>
-          <w:rFonts w:cstheme="minorHAnsi"/>
-          <w:sz w:val="28"/>
-          <w:szCs w:val="28"/>
-        </w:rPr>
-        <w:t>.</w:t>
-      </w:r>
-    </w:p>
-    <w:p>
-      <w:pPr>
-        <w:pStyle w:val="ListParagraph"/>
-        <w:numPr>
-          <w:ilvl w:val="0"/>
-          <w:numId w:val="2"/>
-        </w:numPr>
-        <w:spacing w:line="240" w:lineRule="auto"/>
-        <w:jc w:val="both"/>
-        <w:rPr>
-          <w:rFonts w:cstheme="minorHAnsi"/>
-          <w:sz w:val="28"/>
-          <w:szCs w:val="28"/>
-        </w:rPr>
-      </w:pPr>
-      <w:r>
-        <w:rPr>
-          <w:rFonts w:cstheme="minorHAnsi"/>
-          <w:sz w:val="28"/>
-          <w:szCs w:val="28"/>
-        </w:rPr>
-        <w:t xml:space="preserve"> </w:t>
-      </w:r>
-      <w:r>
-        <w:rPr>
-          <w:rFonts w:cstheme="minorHAnsi"/>
-          <w:sz w:val="28"/>
-          <w:szCs w:val="28"/>
-        </w:rPr>
-        <w:t>“</w:t>
-      </w:r>
-      <w:r>
-        <w:rPr>
-          <w:rFonts w:cstheme="minorHAnsi"/>
-          <w:sz w:val="28"/>
-          <w:szCs w:val="28"/>
-        </w:rPr>
-        <w:t>CIRCULATION PUMP</w:t>
-      </w:r>
-      <w:r>
-        <w:rPr>
-          <w:rFonts w:cstheme="minorHAnsi"/>
-          <w:sz w:val="28"/>
-          <w:szCs w:val="28"/>
-        </w:rPr>
-        <w:t>” starts occasionally</w:t>
-      </w:r>
-      <w:r>
-        <w:rPr>
-          <w:rFonts w:cstheme="minorHAnsi"/>
-          <w:sz w:val="28"/>
-          <w:szCs w:val="28"/>
-        </w:rPr>
-        <w:t>.</w:t>
-      </w:r>
-      <w:r>
-        <w:rPr>
-          <w:rFonts w:cstheme="minorHAnsi"/>
-          <w:sz w:val="28"/>
-          <w:szCs w:val="28"/>
-        </w:rPr>
-        <w:t xml:space="preserve"> </w:t>
-      </w:r>
-      <w:proofErr w:type="spellStart"/>
-      <w:r>
-        <w:rPr>
-          <w:rFonts w:cstheme="minorHAnsi"/>
-          <w:sz w:val="28"/>
-          <w:szCs w:val="28"/>
-        </w:rPr>
-        <w:t>C</w:t>
-      </w:r>
-      <w:r>
-        <w:rPr>
-          <w:rFonts w:cstheme="minorHAnsi"/>
-          <w:sz w:val="28"/>
-          <w:szCs w:val="28"/>
-        </w:rPr>
-        <w:t>an</w:t>
-      </w:r>
-      <w:r>
-        <w:rPr>
-          <w:rFonts w:cstheme="minorHAnsi"/>
-          <w:sz w:val="28"/>
-          <w:szCs w:val="28"/>
-        </w:rPr>
-        <w:t xml:space="preserve"> </w:t>
-      </w:r>
-      <w:r>
-        <w:rPr>
-          <w:rFonts w:cstheme="minorHAnsi"/>
-          <w:sz w:val="28"/>
-          <w:szCs w:val="28"/>
-        </w:rPr>
-        <w:t>not</w:t>
-      </w:r>
-      <w:proofErr w:type="spellEnd"/>
-      <w:r>
-        <w:rPr>
-          <w:rFonts w:cstheme="minorHAnsi"/>
-          <w:sz w:val="28"/>
-          <w:szCs w:val="28"/>
-        </w:rPr>
-        <w:t xml:space="preserve"> be operated manually while in a Normal Working</w:t>
-      </w:r>
-      <w:r>
-        <w:rPr>
-          <w:rFonts w:cstheme="minorHAnsi"/>
-          <w:sz w:val="28"/>
-          <w:szCs w:val="28"/>
-        </w:rPr>
-        <w:t>.</w:t>
       </w:r>
     </w:p>
     <w:p>
@@ -2654,7 +3181,7 @@
         <w:rFonts w:ascii="Wingdings" w:hAnsi="Wingdings" w:hint="default"/>
       </w:rPr>
     </w:lvl>
-    <w:lvl w:ilvl="3" w:tplc="40090001" w:tentative="1">
+    <w:lvl w:ilvl="3" w:tplc="40090001">
       <w:start w:val="1"/>
       <w:numFmt w:val="bullet"/>
       <w:lvlText w:val=""/>
@@ -2666,7 +3193,7 @@
         <w:rFonts w:ascii="Symbol" w:hAnsi="Symbol" w:hint="default"/>
       </w:rPr>
     </w:lvl>
-    <w:lvl w:ilvl="4" w:tplc="40090003" w:tentative="1">
+    <w:lvl w:ilvl="4" w:tplc="40090003">
       <w:start w:val="1"/>
       <w:numFmt w:val="bullet"/>
       <w:lvlText w:val="o"/>
@@ -2768,6 +3295,119 @@
       </w:rPr>
     </w:lvl>
     <w:lvl w:ilvl="3" w:tplc="40090001">
+      <w:start w:val="1"/>
+      <w:numFmt w:val="bullet"/>
+      <w:lvlText w:val=""/>
+      <w:lvlJc w:val="left"/>
+      <w:pPr>
+        <w:ind w:left="2880" w:hanging="360"/>
+      </w:pPr>
+      <w:rPr>
+        <w:rFonts w:ascii="Symbol" w:hAnsi="Symbol" w:hint="default"/>
+      </w:rPr>
+    </w:lvl>
+    <w:lvl w:ilvl="4" w:tplc="40090003">
+      <w:start w:val="1"/>
+      <w:numFmt w:val="bullet"/>
+      <w:lvlText w:val="o"/>
+      <w:lvlJc w:val="left"/>
+      <w:pPr>
+        <w:ind w:left="3600" w:hanging="360"/>
+      </w:pPr>
+      <w:rPr>
+        <w:rFonts w:ascii="Courier New" w:hAnsi="Courier New" w:cs="Courier New" w:hint="default"/>
+      </w:rPr>
+    </w:lvl>
+    <w:lvl w:ilvl="5" w:tplc="40090005" w:tentative="1">
+      <w:start w:val="1"/>
+      <w:numFmt w:val="bullet"/>
+      <w:lvlText w:val=""/>
+      <w:lvlJc w:val="left"/>
+      <w:pPr>
+        <w:ind w:left="4320" w:hanging="360"/>
+      </w:pPr>
+      <w:rPr>
+        <w:rFonts w:ascii="Wingdings" w:hAnsi="Wingdings" w:hint="default"/>
+      </w:rPr>
+    </w:lvl>
+    <w:lvl w:ilvl="6" w:tplc="40090001" w:tentative="1">
+      <w:start w:val="1"/>
+      <w:numFmt w:val="bullet"/>
+      <w:lvlText w:val=""/>
+      <w:lvlJc w:val="left"/>
+      <w:pPr>
+        <w:ind w:left="5040" w:hanging="360"/>
+      </w:pPr>
+      <w:rPr>
+        <w:rFonts w:ascii="Symbol" w:hAnsi="Symbol" w:hint="default"/>
+      </w:rPr>
+    </w:lvl>
+    <w:lvl w:ilvl="7" w:tplc="40090003" w:tentative="1">
+      <w:start w:val="1"/>
+      <w:numFmt w:val="bullet"/>
+      <w:lvlText w:val="o"/>
+      <w:lvlJc w:val="left"/>
+      <w:pPr>
+        <w:ind w:left="5760" w:hanging="360"/>
+      </w:pPr>
+      <w:rPr>
+        <w:rFonts w:ascii="Courier New" w:hAnsi="Courier New" w:cs="Courier New" w:hint="default"/>
+      </w:rPr>
+    </w:lvl>
+    <w:lvl w:ilvl="8" w:tplc="40090005" w:tentative="1">
+      <w:start w:val="1"/>
+      <w:numFmt w:val="bullet"/>
+      <w:lvlText w:val=""/>
+      <w:lvlJc w:val="left"/>
+      <w:pPr>
+        <w:ind w:left="6480" w:hanging="360"/>
+      </w:pPr>
+      <w:rPr>
+        <w:rFonts w:ascii="Wingdings" w:hAnsi="Wingdings" w:hint="default"/>
+      </w:rPr>
+    </w:lvl>
+  </w:abstractNum>
+  <w:abstractNum w:abstractNumId="6" w15:restartNumberingAfterBreak="0">
+    <w:nsid w:val="7B0C5178"/>
+    <w:multiLevelType w:val="hybridMultilevel"/>
+    <w:tmpl w:val="6A62C2B0"/>
+    <w:lvl w:ilvl="0" w:tplc="40090001">
+      <w:start w:val="1"/>
+      <w:numFmt w:val="bullet"/>
+      <w:lvlText w:val=""/>
+      <w:lvlJc w:val="left"/>
+      <w:pPr>
+        <w:ind w:left="720" w:hanging="360"/>
+      </w:pPr>
+      <w:rPr>
+        <w:rFonts w:ascii="Symbol" w:hAnsi="Symbol" w:hint="default"/>
+      </w:rPr>
+    </w:lvl>
+    <w:lvl w:ilvl="1" w:tplc="40090003">
+      <w:start w:val="1"/>
+      <w:numFmt w:val="bullet"/>
+      <w:lvlText w:val="o"/>
+      <w:lvlJc w:val="left"/>
+      <w:pPr>
+        <w:ind w:left="1440" w:hanging="360"/>
+      </w:pPr>
+      <w:rPr>
+        <w:rFonts w:ascii="Courier New" w:hAnsi="Courier New" w:cs="Courier New" w:hint="default"/>
+      </w:rPr>
+    </w:lvl>
+    <w:lvl w:ilvl="2" w:tplc="40090005" w:tentative="1">
+      <w:start w:val="1"/>
+      <w:numFmt w:val="bullet"/>
+      <w:lvlText w:val=""/>
+      <w:lvlJc w:val="left"/>
+      <w:pPr>
+        <w:ind w:left="2160" w:hanging="360"/>
+      </w:pPr>
+      <w:rPr>
+        <w:rFonts w:ascii="Wingdings" w:hAnsi="Wingdings" w:hint="default"/>
+      </w:rPr>
+    </w:lvl>
+    <w:lvl w:ilvl="3" w:tplc="40090001" w:tentative="1">
       <w:start w:val="1"/>
       <w:numFmt w:val="bullet"/>
       <w:lvlText w:val=""/>
@@ -2857,6 +3497,9 @@
   </w:num>
   <w:num w:numId="6">
     <w:abstractNumId w:val="1"/>
+  </w:num>
+  <w:num w:numId="7">
+    <w:abstractNumId w:val="6"/>
   </w:num>
 </w:numbering>
 </file>
@@ -3644,7 +4287,7 @@
 </file>
 
 <file path=customXml/itemProps1.xml><?xml version="1.0" encoding="utf-8"?>
-<ds:datastoreItem xmlns:ds="http://schemas.openxmlformats.org/officeDocument/2006/customXml" ds:itemID="{DF4BDA11-242C-432C-9E49-7E21EA4CD35A}">
+<ds:datastoreItem xmlns:ds="http://schemas.openxmlformats.org/officeDocument/2006/customXml" ds:itemID="{29FC15E5-239F-4D4F-9B45-6698B60B0FA6}">
   <ds:schemaRefs>
     <ds:schemaRef ds:uri="http://schemas.openxmlformats.org/officeDocument/2006/bibliography"/>
   </ds:schemaRefs>

</xml_diff>

<commit_message>
feature: created separate httpServer files.
Separate httpServer files to manage the server. Server will be on during STA mode also.
</commit_message>
<xml_diff>
--- a/doc/BALBOA WORKING.docx
+++ b/doc/BALBOA WORKING.docx
@@ -96,7 +96,15 @@
           <w:sz w:val="28"/>
           <w:szCs w:val="28"/>
         </w:rPr>
-        <w:t>Power On, Priming Mode</w:t>
+        <w:t xml:space="preserve">At Power on -&gt; </w:t>
+      </w:r>
+      <w:r>
+        <w:rPr>
+          <w:rFonts w:cstheme="minorHAnsi"/>
+          <w:sz w:val="28"/>
+          <w:szCs w:val="28"/>
+        </w:rPr>
+        <w:t>Priming Mode</w:t>
       </w:r>
       <w:r>
         <w:rPr>
@@ -112,7 +120,39 @@
           <w:sz w:val="28"/>
           <w:szCs w:val="28"/>
         </w:rPr>
-        <w:t>for some time and then switches to the normal working mode.</w:t>
+        <w:t xml:space="preserve">for some time </w:t>
+      </w:r>
+      <w:r>
+        <w:rPr>
+          <w:rFonts w:cstheme="minorHAnsi"/>
+          <w:sz w:val="28"/>
+          <w:szCs w:val="28"/>
+        </w:rPr>
+        <w:t>-&gt; N</w:t>
+      </w:r>
+      <w:r>
+        <w:rPr>
+          <w:rFonts w:cstheme="minorHAnsi"/>
+          <w:sz w:val="28"/>
+          <w:szCs w:val="28"/>
+        </w:rPr>
+        <w:t xml:space="preserve">ormal </w:t>
+      </w:r>
+      <w:r>
+        <w:rPr>
+          <w:rFonts w:cstheme="minorHAnsi"/>
+          <w:sz w:val="28"/>
+          <w:szCs w:val="28"/>
+        </w:rPr>
+        <w:t>w</w:t>
+      </w:r>
+      <w:r>
+        <w:rPr>
+          <w:rFonts w:cstheme="minorHAnsi"/>
+          <w:sz w:val="28"/>
+          <w:szCs w:val="28"/>
+        </w:rPr>
+        <w:t>orking mode.</w:t>
       </w:r>
     </w:p>
     <w:p>
@@ -184,15 +224,39 @@
           <w:sz w:val="28"/>
           <w:szCs w:val="28"/>
         </w:rPr>
-        <w:t xml:space="preserve">Manually </w:t>
-      </w:r>
-      <w:r>
-        <w:rPr>
-          <w:rFonts w:cstheme="minorHAnsi"/>
-          <w:sz w:val="28"/>
-          <w:szCs w:val="28"/>
-        </w:rPr>
-        <w:t>exit the Priming mode by pressing the back-arrow button in upper left corner.</w:t>
+        <w:t>To m</w:t>
+      </w:r>
+      <w:r>
+        <w:rPr>
+          <w:rFonts w:cstheme="minorHAnsi"/>
+          <w:sz w:val="28"/>
+          <w:szCs w:val="28"/>
+        </w:rPr>
+        <w:t xml:space="preserve">anually </w:t>
+      </w:r>
+      <w:r>
+        <w:rPr>
+          <w:rFonts w:cstheme="minorHAnsi"/>
+          <w:sz w:val="28"/>
+          <w:szCs w:val="28"/>
+        </w:rPr>
+        <w:t xml:space="preserve">exit Priming mode </w:t>
+      </w:r>
+      <w:r>
+        <w:rPr>
+          <w:rFonts w:cstheme="minorHAnsi"/>
+          <w:sz w:val="28"/>
+          <w:szCs w:val="28"/>
+        </w:rPr>
+        <w:t xml:space="preserve">-&gt; </w:t>
+      </w:r>
+      <w:r>
+        <w:rPr>
+          <w:rFonts w:cstheme="minorHAnsi"/>
+          <w:sz w:val="28"/>
+          <w:szCs w:val="28"/>
+        </w:rPr>
+        <w:t>back-arrow button in upper left corner.</w:t>
       </w:r>
     </w:p>
     <w:p>
@@ -576,6 +640,7 @@
           <w:sz w:val="28"/>
           <w:szCs w:val="28"/>
         </w:rPr>
+        <w:lastRenderedPageBreak/>
         <w:t>Temp Range Icon:</w:t>
       </w:r>
     </w:p>
@@ -631,7 +696,6 @@
       <w:pPr>
         <w:pStyle w:val="ListParagraph"/>
         <w:spacing w:line="240" w:lineRule="auto"/>
-        <w:jc w:val="center"/>
         <w:rPr>
           <w:rFonts w:cstheme="minorHAnsi"/>
           <w:sz w:val="28"/>
@@ -740,7 +804,6 @@
       <w:pPr>
         <w:pStyle w:val="ListParagraph"/>
         <w:spacing w:line="240" w:lineRule="auto"/>
-        <w:jc w:val="center"/>
         <w:rPr>
           <w:rFonts w:cstheme="minorHAnsi"/>
           <w:sz w:val="28"/>
@@ -880,6 +943,18 @@
           <w:szCs w:val="28"/>
         </w:rPr>
       </w:pPr>
+    </w:p>
+    <w:p>
+      <w:pPr>
+        <w:spacing w:line="240" w:lineRule="auto"/>
+        <w:jc w:val="both"/>
+        <w:rPr>
+          <w:rFonts w:cstheme="minorHAnsi"/>
+          <w:b/>
+          <w:sz w:val="28"/>
+          <w:szCs w:val="28"/>
+        </w:rPr>
+      </w:pPr>
       <w:r>
         <w:rPr>
           <w:rFonts w:cstheme="minorHAnsi"/>
@@ -943,7 +1018,6 @@
       <w:pPr>
         <w:pStyle w:val="ListParagraph"/>
         <w:spacing w:line="240" w:lineRule="auto"/>
-        <w:jc w:val="center"/>
         <w:rPr>
           <w:rFonts w:cstheme="minorHAnsi"/>
           <w:sz w:val="28"/>
@@ -1052,7 +1126,6 @@
       <w:pPr>
         <w:pStyle w:val="ListParagraph"/>
         <w:spacing w:line="240" w:lineRule="auto"/>
-        <w:jc w:val="center"/>
         <w:rPr>
           <w:rFonts w:cstheme="minorHAnsi"/>
           <w:sz w:val="28"/>
@@ -1145,7 +1218,6 @@
       <w:pPr>
         <w:pStyle w:val="ListParagraph"/>
         <w:spacing w:line="240" w:lineRule="auto"/>
-        <w:jc w:val="center"/>
         <w:rPr>
           <w:rFonts w:cstheme="minorHAnsi"/>
           <w:sz w:val="28"/>
@@ -1700,7 +1772,6 @@
           <w:numId w:val="2"/>
         </w:numPr>
         <w:spacing w:line="240" w:lineRule="auto"/>
-        <w:jc w:val="both"/>
         <w:rPr>
           <w:rFonts w:cstheme="minorHAnsi"/>
           <w:b/>
@@ -1714,7 +1785,7 @@
           <w:sz w:val="28"/>
           <w:szCs w:val="28"/>
         </w:rPr>
-        <w:t xml:space="preserve"> “</w:t>
+        <w:t>“</w:t>
       </w:r>
       <w:r>
         <w:rPr>
@@ -1825,8 +1896,8 @@
     </w:p>
     <w:p>
       <w:pPr>
-        <w:pStyle w:val="ListParagraph"/>
-        <w:spacing w:line="240" w:lineRule="auto"/>
+        <w:spacing w:line="240" w:lineRule="auto"/>
+        <w:ind w:left="360"/>
         <w:jc w:val="center"/>
         <w:rPr>
           <w:rFonts w:cstheme="minorHAnsi"/>
@@ -1838,16 +1909,12 @@
       <w:bookmarkStart w:id="0" w:name="_GoBack"/>
       <w:r>
         <w:rPr>
-          <w:rFonts w:cstheme="minorHAnsi"/>
-          <w:b/>
           <w:noProof/>
-          <w:sz w:val="28"/>
-          <w:szCs w:val="28"/>
         </w:rPr>
         <w:drawing>
-          <wp:inline distT="0" distB="0" distL="0" distR="0" wp14:anchorId="361153DF" wp14:editId="0DD3287F">
-            <wp:extent cx="5313045" cy="3228975"/>
-            <wp:effectExtent l="0" t="0" r="1905" b="9525"/>
+          <wp:inline distT="0" distB="0" distL="0" distR="0" wp14:anchorId="361153DF" wp14:editId="160120E6">
+            <wp:extent cx="5753155" cy="4218787"/>
+            <wp:effectExtent l="0" t="0" r="0" b="0"/>
             <wp:docPr id="7" name="Picture 7"/>
             <wp:cNvGraphicFramePr>
               <a:graphicFrameLocks xmlns:a="http://schemas.openxmlformats.org/drawingml/2006/main" noChangeAspect="1"/>
@@ -1874,7 +1941,7 @@
                   <pic:spPr>
                     <a:xfrm>
                       <a:off x="0" y="0"/>
-                      <a:ext cx="5354245" cy="3254014"/>
+                      <a:ext cx="5881458" cy="4312872"/>
                     </a:xfrm>
                     <a:prstGeom prst="rect">
                       <a:avLst/>
@@ -2011,6 +2078,7 @@
           <w:sz w:val="28"/>
           <w:szCs w:val="28"/>
         </w:rPr>
+        <w:lastRenderedPageBreak/>
         <w:t>HEAT WAITING</w:t>
       </w:r>
       <w:r>
@@ -2291,7 +2359,6 @@
           <w:sz w:val="28"/>
           <w:szCs w:val="28"/>
         </w:rPr>
-        <w:lastRenderedPageBreak/>
         <w:t>(</w:t>
       </w:r>
       <w:r>
@@ -4287,7 +4354,7 @@
 </file>
 
 <file path=customXml/itemProps1.xml><?xml version="1.0" encoding="utf-8"?>
-<ds:datastoreItem xmlns:ds="http://schemas.openxmlformats.org/officeDocument/2006/customXml" ds:itemID="{29FC15E5-239F-4D4F-9B45-6698B60B0FA6}">
+<ds:datastoreItem xmlns:ds="http://schemas.openxmlformats.org/officeDocument/2006/customXml" ds:itemID="{29BC7AC5-942C-4D0A-8AEF-AB8B933968CC}">
   <ds:schemaRefs>
     <ds:schemaRef ds:uri="http://schemas.openxmlformats.org/officeDocument/2006/bibliography"/>
   </ds:schemaRefs>

</xml_diff>